<commit_message>
Add template + feature gabungan
</commit_message>
<xml_diff>
--- a/public/templates/BERKAS PEMBAYARAN PML.docx
+++ b/public/templates/BERKAS PEMBAYARAN PML.docx
@@ -5470,25 +5470,7 @@
           <w:sz w:val="24"/>
           <w:szCs w:val="24"/>
         </w:rPr>
-        <w:t xml:space="preserve"> </w:t>
-      </w:r>
-      <w:proofErr w:type="spellStart"/>
-      <w:r>
-        <w:rPr>
-          <w:rFonts w:ascii="Bookman Old Style" w:eastAsia="Bookman Old Style" w:hAnsi="Bookman Old Style" w:cs="Bookman Old Style"/>
-          <w:sz w:val="24"/>
-          <w:szCs w:val="24"/>
-        </w:rPr>
-        <w:t>hal</w:t>
-      </w:r>
-      <w:proofErr w:type="spellEnd"/>
-      <w:r>
-        <w:rPr>
-          <w:rFonts w:ascii="Bookman Old Style" w:eastAsia="Bookman Old Style" w:hAnsi="Bookman Old Style" w:cs="Bookman Old Style"/>
-          <w:sz w:val="24"/>
-          <w:szCs w:val="24"/>
-        </w:rPr>
-        <w:t xml:space="preserve"> </w:t>
+        <w:t xml:space="preserve"> hal </w:t>
       </w:r>
       <w:proofErr w:type="spellStart"/>
       <w:r>
@@ -17376,38 +17358,6 @@
         <w:t>BUKTI PENYELESAIAN PEKERJAAN</w:t>
       </w:r>
     </w:p>
-    <w:p>
-      <w:pPr>
-        <w:numPr>
-          <w:ilvl w:val="0"/>
-          <w:numId w:val="5"/>
-        </w:numPr>
-        <w:spacing w:after="0" w:line="240" w:lineRule="auto"/>
-        <w:rPr>
-          <w:rFonts w:ascii="Bookman Old Style" w:eastAsia="Bookman Old Style" w:hAnsi="Bookman Old Style" w:cs="Bookman Old Style"/>
-          <w:sz w:val="24"/>
-          <w:szCs w:val="24"/>
-        </w:rPr>
-      </w:pPr>
-      <w:r>
-        <w:rPr>
-          <w:rFonts w:ascii="Bookman Old Style" w:eastAsia="Bookman Old Style" w:hAnsi="Bookman Old Style" w:cs="Bookman Old Style"/>
-          <w:sz w:val="24"/>
-          <w:szCs w:val="24"/>
-        </w:rPr>
-        <w:t>DAFTAR PETUGAS DAN WILAYAH KERJA</w:t>
-      </w:r>
-    </w:p>
-    <w:p>
-      <w:pPr>
-        <w:spacing w:before="120"/>
-        <w:rPr>
-          <w:rFonts w:ascii="Bookman Old Style" w:eastAsia="Bookman Old Style" w:hAnsi="Bookman Old Style" w:cs="Bookman Old Style"/>
-          <w:sz w:val="24"/>
-          <w:szCs w:val="24"/>
-        </w:rPr>
-      </w:pPr>
-    </w:p>
     <w:tbl>
       <w:tblPr>
         <w:tblW w:w="5000" w:type="pct"/>
@@ -18300,6 +18250,2959 @@
         </w:rPr>
         <w:t xml:space="preserve"> 14 Juli 2026</w:t>
       </w:r>
+    </w:p>
+    <w:p>
+      <w:pPr>
+        <w:rPr>
+          <w:rFonts w:ascii="Bookman Old Style" w:eastAsia="Bookman Old Style" w:hAnsi="Bookman Old Style" w:cs="Bookman Old Style"/>
+          <w:i/>
+          <w:iCs/>
+          <w:sz w:val="16"/>
+          <w:szCs w:val="16"/>
+        </w:rPr>
+      </w:pPr>
+      <w:r>
+        <w:rPr>
+          <w:rFonts w:ascii="Bookman Old Style" w:eastAsia="Bookman Old Style" w:hAnsi="Bookman Old Style" w:cs="Bookman Old Style"/>
+          <w:i/>
+          <w:iCs/>
+          <w:sz w:val="16"/>
+          <w:szCs w:val="16"/>
+        </w:rPr>
+        <w:br w:type="page"/>
+      </w:r>
+    </w:p>
+    <w:tbl>
+      <w:tblPr>
+        <w:tblW w:w="5000" w:type="pct"/>
+        <w:tblLook w:val="04A0" w:firstRow="1" w:lastRow="0" w:firstColumn="1" w:lastColumn="0" w:noHBand="0" w:noVBand="1"/>
+      </w:tblPr>
+      <w:tblGrid>
+        <w:gridCol w:w="13954"/>
+      </w:tblGrid>
+      <w:tr>
+        <w:trPr>
+          <w:trHeight w:val="480"/>
+        </w:trPr>
+        <w:tc>
+          <w:tcPr>
+            <w:tcW w:w="5000" w:type="pct"/>
+            <w:tcBorders>
+              <w:top w:val="nil"/>
+              <w:left w:val="nil"/>
+              <w:bottom w:val="nil"/>
+              <w:right w:val="nil"/>
+            </w:tcBorders>
+            <w:noWrap/>
+            <w:vAlign w:val="center"/>
+            <w:hideMark/>
+          </w:tcPr>
+          <w:p>
+            <w:pPr>
+              <w:spacing w:after="0" w:line="240" w:lineRule="auto"/>
+              <w:jc w:val="center"/>
+              <w:rPr>
+                <w:rFonts w:ascii="Arial" w:eastAsia="Times New Roman" w:hAnsi="Arial" w:cs="Arial"/>
+                <w:b/>
+                <w:bCs/>
+                <w:color w:val="000000"/>
+              </w:rPr>
+            </w:pPr>
+            <w:r>
+              <w:rPr>
+                <w:rFonts w:ascii="Arial" w:eastAsia="Times New Roman" w:hAnsi="Arial" w:cs="Arial"/>
+                <w:b/>
+                <w:bCs/>
+                <w:color w:val="000000"/>
+              </w:rPr>
+              <w:lastRenderedPageBreak/>
+              <w:t xml:space="preserve">Beban </w:t>
+            </w:r>
+            <w:proofErr w:type="spellStart"/>
+            <w:r>
+              <w:rPr>
+                <w:rFonts w:ascii="Arial" w:eastAsia="Times New Roman" w:hAnsi="Arial" w:cs="Arial"/>
+                <w:b/>
+                <w:bCs/>
+                <w:color w:val="000000"/>
+              </w:rPr>
+              <w:t>Kerja</w:t>
+            </w:r>
+            <w:proofErr w:type="spellEnd"/>
+            <w:r>
+              <w:rPr>
+                <w:rFonts w:ascii="Arial" w:eastAsia="Times New Roman" w:hAnsi="Arial" w:cs="Arial"/>
+                <w:b/>
+                <w:bCs/>
+                <w:color w:val="000000"/>
+              </w:rPr>
+              <w:t xml:space="preserve"> </w:t>
+            </w:r>
+            <w:proofErr w:type="spellStart"/>
+            <w:r>
+              <w:rPr>
+                <w:rFonts w:ascii="Arial" w:eastAsia="Times New Roman" w:hAnsi="Arial" w:cs="Arial"/>
+                <w:b/>
+                <w:bCs/>
+                <w:color w:val="000000"/>
+              </w:rPr>
+              <w:t>Petugas</w:t>
+            </w:r>
+            <w:proofErr w:type="spellEnd"/>
+            <w:r>
+              <w:rPr>
+                <w:rFonts w:ascii="Arial" w:eastAsia="Times New Roman" w:hAnsi="Arial" w:cs="Arial"/>
+                <w:b/>
+                <w:bCs/>
+                <w:color w:val="000000"/>
+              </w:rPr>
+              <w:t xml:space="preserve"> </w:t>
+            </w:r>
+            <w:proofErr w:type="spellStart"/>
+            <w:r>
+              <w:rPr>
+                <w:rFonts w:ascii="Arial" w:eastAsia="Times New Roman" w:hAnsi="Arial" w:cs="Arial"/>
+                <w:b/>
+                <w:bCs/>
+                <w:color w:val="000000"/>
+              </w:rPr>
+              <w:t>Pemeriksa</w:t>
+            </w:r>
+            <w:proofErr w:type="spellEnd"/>
+            <w:r>
+              <w:rPr>
+                <w:rFonts w:ascii="Arial" w:eastAsia="Times New Roman" w:hAnsi="Arial" w:cs="Arial"/>
+                <w:b/>
+                <w:bCs/>
+                <w:color w:val="000000"/>
+              </w:rPr>
+              <w:t xml:space="preserve"> Lapangan SE2026</w:t>
+            </w:r>
+          </w:p>
+        </w:tc>
+      </w:tr>
+      <w:tr>
+        <w:trPr>
+          <w:trHeight w:val="480"/>
+        </w:trPr>
+        <w:tc>
+          <w:tcPr>
+            <w:tcW w:w="5000" w:type="pct"/>
+            <w:tcBorders>
+              <w:top w:val="nil"/>
+              <w:left w:val="nil"/>
+              <w:bottom w:val="nil"/>
+              <w:right w:val="nil"/>
+            </w:tcBorders>
+            <w:noWrap/>
+            <w:vAlign w:val="center"/>
+            <w:hideMark/>
+          </w:tcPr>
+          <w:p>
+            <w:pPr>
+              <w:spacing w:after="0" w:line="240" w:lineRule="auto"/>
+              <w:jc w:val="center"/>
+              <w:rPr>
+                <w:rFonts w:ascii="Arial" w:eastAsia="Times New Roman" w:hAnsi="Arial" w:cs="Arial"/>
+                <w:b/>
+                <w:bCs/>
+                <w:color w:val="000000"/>
+              </w:rPr>
+            </w:pPr>
+            <w:r>
+              <w:rPr>
+                <w:rFonts w:ascii="Arial" w:eastAsia="Times New Roman" w:hAnsi="Arial" w:cs="Arial"/>
+                <w:b/>
+                <w:bCs/>
+                <w:color w:val="000000"/>
+              </w:rPr>
+              <w:t>Kota Jakarta Timur</w:t>
+            </w:r>
+            <w:r>
+              <w:rPr>
+                <w:rFonts w:ascii="Arial" w:eastAsia="Times New Roman" w:hAnsi="Arial" w:cs="Arial"/>
+                <w:b/>
+                <w:bCs/>
+                <w:color w:val="000000"/>
+              </w:rPr>
+              <w:t xml:space="preserve"> </w:t>
+            </w:r>
+            <w:proofErr w:type="spellStart"/>
+            <w:r>
+              <w:rPr>
+                <w:rFonts w:ascii="Arial" w:eastAsia="Times New Roman" w:hAnsi="Arial" w:cs="Arial"/>
+                <w:b/>
+                <w:bCs/>
+                <w:color w:val="000000"/>
+              </w:rPr>
+              <w:t>Provinsi</w:t>
+            </w:r>
+            <w:proofErr w:type="spellEnd"/>
+            <w:r>
+              <w:rPr>
+                <w:rFonts w:ascii="Arial" w:eastAsia="Times New Roman" w:hAnsi="Arial" w:cs="Arial"/>
+                <w:b/>
+                <w:bCs/>
+                <w:color w:val="000000"/>
+              </w:rPr>
+              <w:t xml:space="preserve"> </w:t>
+            </w:r>
+            <w:r>
+              <w:rPr>
+                <w:rFonts w:ascii="Arial" w:eastAsia="Times New Roman" w:hAnsi="Arial" w:cs="Arial"/>
+                <w:b/>
+                <w:bCs/>
+                <w:color w:val="000000"/>
+              </w:rPr>
+              <w:t>DKI Jakarta</w:t>
+            </w:r>
+          </w:p>
+        </w:tc>
+      </w:tr>
+    </w:tbl>
+    <w:p/>
+    <w:tbl>
+      <w:tblPr>
+        <w:tblW w:w="5000" w:type="pct"/>
+        <w:tblLook w:val="04A0" w:firstRow="1" w:lastRow="0" w:firstColumn="1" w:lastColumn="0" w:noHBand="0" w:noVBand="1"/>
+      </w:tblPr>
+      <w:tblGrid>
+        <w:gridCol w:w="989"/>
+        <w:gridCol w:w="1104"/>
+        <w:gridCol w:w="1090"/>
+        <w:gridCol w:w="832"/>
+        <w:gridCol w:w="819"/>
+        <w:gridCol w:w="1225"/>
+        <w:gridCol w:w="1164"/>
+        <w:gridCol w:w="778"/>
+        <w:gridCol w:w="1008"/>
+        <w:gridCol w:w="874"/>
+        <w:gridCol w:w="900"/>
+        <w:gridCol w:w="792"/>
+        <w:gridCol w:w="1482"/>
+        <w:gridCol w:w="887"/>
+      </w:tblGrid>
+      <w:tr>
+        <w:trPr>
+          <w:trHeight w:val="618"/>
+        </w:trPr>
+        <w:tc>
+          <w:tcPr>
+            <w:tcW w:w="355" w:type="pct"/>
+            <w:vMerge w:val="restart"/>
+            <w:tcBorders>
+              <w:top w:val="single" w:sz="4" w:space="0" w:color="auto"/>
+              <w:left w:val="single" w:sz="4" w:space="0" w:color="auto"/>
+              <w:bottom w:val="single" w:sz="4" w:space="0" w:color="000000"/>
+              <w:right w:val="single" w:sz="4" w:space="0" w:color="auto"/>
+            </w:tcBorders>
+            <w:vAlign w:val="center"/>
+            <w:hideMark/>
+          </w:tcPr>
+          <w:p>
+            <w:pPr>
+              <w:spacing w:after="0" w:line="240" w:lineRule="auto"/>
+              <w:jc w:val="center"/>
+              <w:rPr>
+                <w:rFonts w:ascii="Arial" w:eastAsia="Times New Roman" w:hAnsi="Arial" w:cs="Arial"/>
+                <w:b/>
+                <w:bCs/>
+                <w:color w:val="000000"/>
+                <w:sz w:val="16"/>
+                <w:szCs w:val="16"/>
+              </w:rPr>
+            </w:pPr>
+            <w:r>
+              <w:rPr>
+                <w:rFonts w:ascii="Arial" w:eastAsia="Times New Roman" w:hAnsi="Arial" w:cs="Arial"/>
+                <w:b/>
+                <w:bCs/>
+                <w:color w:val="000000"/>
+                <w:sz w:val="16"/>
+                <w:szCs w:val="16"/>
+              </w:rPr>
+              <w:t>No</w:t>
+            </w:r>
+          </w:p>
+        </w:tc>
+        <w:tc>
+          <w:tcPr>
+            <w:tcW w:w="787" w:type="pct"/>
+            <w:gridSpan w:val="2"/>
+            <w:tcBorders>
+              <w:top w:val="single" w:sz="4" w:space="0" w:color="auto"/>
+              <w:left w:val="nil"/>
+              <w:bottom w:val="single" w:sz="4" w:space="0" w:color="auto"/>
+              <w:right w:val="single" w:sz="4" w:space="0" w:color="auto"/>
+            </w:tcBorders>
+            <w:vAlign w:val="center"/>
+            <w:hideMark/>
+          </w:tcPr>
+          <w:p>
+            <w:pPr>
+              <w:spacing w:after="0" w:line="240" w:lineRule="auto"/>
+              <w:jc w:val="center"/>
+              <w:rPr>
+                <w:rFonts w:ascii="Arial" w:eastAsia="Times New Roman" w:hAnsi="Arial" w:cs="Arial"/>
+                <w:b/>
+                <w:bCs/>
+                <w:color w:val="000000"/>
+                <w:sz w:val="16"/>
+                <w:szCs w:val="16"/>
+              </w:rPr>
+            </w:pPr>
+            <w:r>
+              <w:rPr>
+                <w:rFonts w:ascii="Arial" w:eastAsia="Times New Roman" w:hAnsi="Arial" w:cs="Arial"/>
+                <w:b/>
+                <w:bCs/>
+                <w:color w:val="000000"/>
+                <w:sz w:val="16"/>
+                <w:szCs w:val="16"/>
+              </w:rPr>
+              <w:t>PML</w:t>
+            </w:r>
+          </w:p>
+        </w:tc>
+        <w:tc>
+          <w:tcPr>
+            <w:tcW w:w="592" w:type="pct"/>
+            <w:gridSpan w:val="2"/>
+            <w:tcBorders>
+              <w:top w:val="single" w:sz="4" w:space="0" w:color="auto"/>
+              <w:left w:val="nil"/>
+              <w:bottom w:val="single" w:sz="4" w:space="0" w:color="auto"/>
+              <w:right w:val="single" w:sz="4" w:space="0" w:color="auto"/>
+            </w:tcBorders>
+            <w:vAlign w:val="center"/>
+            <w:hideMark/>
+          </w:tcPr>
+          <w:p>
+            <w:pPr>
+              <w:spacing w:after="0" w:line="240" w:lineRule="auto"/>
+              <w:jc w:val="center"/>
+              <w:rPr>
+                <w:rFonts w:ascii="Arial" w:eastAsia="Times New Roman" w:hAnsi="Arial" w:cs="Arial"/>
+                <w:b/>
+                <w:bCs/>
+                <w:color w:val="000000"/>
+                <w:sz w:val="16"/>
+                <w:szCs w:val="16"/>
+              </w:rPr>
+            </w:pPr>
+            <w:r>
+              <w:rPr>
+                <w:rFonts w:ascii="Arial" w:eastAsia="Times New Roman" w:hAnsi="Arial" w:cs="Arial"/>
+                <w:b/>
+                <w:bCs/>
+                <w:color w:val="000000"/>
+                <w:sz w:val="16"/>
+                <w:szCs w:val="16"/>
+              </w:rPr>
+              <w:t>PPL</w:t>
+            </w:r>
+          </w:p>
+        </w:tc>
+        <w:tc>
+          <w:tcPr>
+            <w:tcW w:w="439" w:type="pct"/>
+            <w:vMerge w:val="restart"/>
+            <w:tcBorders>
+              <w:top w:val="single" w:sz="4" w:space="0" w:color="auto"/>
+              <w:left w:val="single" w:sz="4" w:space="0" w:color="auto"/>
+              <w:bottom w:val="single" w:sz="4" w:space="0" w:color="000000"/>
+              <w:right w:val="single" w:sz="4" w:space="0" w:color="auto"/>
+            </w:tcBorders>
+            <w:vAlign w:val="center"/>
+            <w:hideMark/>
+          </w:tcPr>
+          <w:p>
+            <w:pPr>
+              <w:spacing w:after="0" w:line="240" w:lineRule="auto"/>
+              <w:jc w:val="center"/>
+              <w:rPr>
+                <w:rFonts w:ascii="Arial" w:eastAsia="Times New Roman" w:hAnsi="Arial" w:cs="Arial"/>
+                <w:b/>
+                <w:bCs/>
+                <w:color w:val="000000"/>
+                <w:sz w:val="16"/>
+                <w:szCs w:val="16"/>
+              </w:rPr>
+            </w:pPr>
+            <w:r>
+              <w:rPr>
+                <w:rFonts w:ascii="Arial" w:eastAsia="Times New Roman" w:hAnsi="Arial" w:cs="Arial"/>
+                <w:b/>
+                <w:bCs/>
+                <w:color w:val="000000"/>
+                <w:sz w:val="16"/>
+                <w:szCs w:val="16"/>
+              </w:rPr>
+              <w:t xml:space="preserve">[Kode] </w:t>
+            </w:r>
+            <w:r>
+              <w:rPr>
+                <w:rFonts w:ascii="Arial" w:eastAsia="Times New Roman" w:hAnsi="Arial" w:cs="Arial"/>
+                <w:b/>
+                <w:bCs/>
+                <w:color w:val="000000"/>
+                <w:sz w:val="16"/>
+                <w:szCs w:val="16"/>
+              </w:rPr>
+              <w:br/>
+              <w:t>KEC</w:t>
+            </w:r>
+          </w:p>
+        </w:tc>
+        <w:tc>
+          <w:tcPr>
+            <w:tcW w:w="417" w:type="pct"/>
+            <w:vMerge w:val="restart"/>
+            <w:tcBorders>
+              <w:top w:val="single" w:sz="4" w:space="0" w:color="auto"/>
+              <w:left w:val="single" w:sz="4" w:space="0" w:color="auto"/>
+              <w:bottom w:val="single" w:sz="4" w:space="0" w:color="000000"/>
+              <w:right w:val="single" w:sz="4" w:space="0" w:color="auto"/>
+            </w:tcBorders>
+            <w:vAlign w:val="center"/>
+            <w:hideMark/>
+          </w:tcPr>
+          <w:p>
+            <w:pPr>
+              <w:spacing w:after="0" w:line="240" w:lineRule="auto"/>
+              <w:jc w:val="center"/>
+              <w:rPr>
+                <w:rFonts w:ascii="Arial" w:eastAsia="Times New Roman" w:hAnsi="Arial" w:cs="Arial"/>
+                <w:b/>
+                <w:bCs/>
+                <w:color w:val="000000"/>
+                <w:sz w:val="16"/>
+                <w:szCs w:val="16"/>
+              </w:rPr>
+            </w:pPr>
+            <w:r>
+              <w:rPr>
+                <w:rFonts w:ascii="Arial" w:eastAsia="Times New Roman" w:hAnsi="Arial" w:cs="Arial"/>
+                <w:b/>
+                <w:bCs/>
+                <w:color w:val="000000"/>
+                <w:sz w:val="16"/>
+                <w:szCs w:val="16"/>
+              </w:rPr>
+              <w:t xml:space="preserve">[Kode] </w:t>
+            </w:r>
+            <w:r>
+              <w:rPr>
+                <w:rFonts w:ascii="Arial" w:eastAsia="Times New Roman" w:hAnsi="Arial" w:cs="Arial"/>
+                <w:b/>
+                <w:bCs/>
+                <w:color w:val="000000"/>
+                <w:sz w:val="16"/>
+                <w:szCs w:val="16"/>
+              </w:rPr>
+              <w:br/>
+              <w:t>DESA/LURAH</w:t>
+            </w:r>
+          </w:p>
+        </w:tc>
+        <w:tc>
+          <w:tcPr>
+            <w:tcW w:w="279" w:type="pct"/>
+            <w:vMerge w:val="restart"/>
+            <w:tcBorders>
+              <w:top w:val="single" w:sz="4" w:space="0" w:color="auto"/>
+              <w:left w:val="single" w:sz="4" w:space="0" w:color="auto"/>
+              <w:bottom w:val="single" w:sz="4" w:space="0" w:color="000000"/>
+              <w:right w:val="single" w:sz="4" w:space="0" w:color="auto"/>
+            </w:tcBorders>
+            <w:vAlign w:val="center"/>
+            <w:hideMark/>
+          </w:tcPr>
+          <w:p>
+            <w:pPr>
+              <w:spacing w:after="0" w:line="240" w:lineRule="auto"/>
+              <w:jc w:val="center"/>
+              <w:rPr>
+                <w:rFonts w:ascii="Arial" w:eastAsia="Times New Roman" w:hAnsi="Arial" w:cs="Arial"/>
+                <w:b/>
+                <w:bCs/>
+                <w:color w:val="000000"/>
+                <w:sz w:val="16"/>
+                <w:szCs w:val="16"/>
+              </w:rPr>
+            </w:pPr>
+            <w:r>
+              <w:rPr>
+                <w:rFonts w:ascii="Arial" w:eastAsia="Times New Roman" w:hAnsi="Arial" w:cs="Arial"/>
+                <w:b/>
+                <w:bCs/>
+                <w:color w:val="000000"/>
+                <w:sz w:val="16"/>
+                <w:szCs w:val="16"/>
+              </w:rPr>
+              <w:t>[Kode]</w:t>
+            </w:r>
+            <w:r>
+              <w:rPr>
+                <w:rFonts w:ascii="Arial" w:eastAsia="Times New Roman" w:hAnsi="Arial" w:cs="Arial"/>
+                <w:b/>
+                <w:bCs/>
+                <w:color w:val="000000"/>
+                <w:sz w:val="16"/>
+                <w:szCs w:val="16"/>
+              </w:rPr>
+              <w:br/>
+              <w:t>SLS/Sub-SLS</w:t>
+            </w:r>
+          </w:p>
+        </w:tc>
+        <w:tc>
+          <w:tcPr>
+            <w:tcW w:w="998" w:type="pct"/>
+            <w:gridSpan w:val="3"/>
+            <w:tcBorders>
+              <w:top w:val="single" w:sz="4" w:space="0" w:color="auto"/>
+              <w:left w:val="nil"/>
+              <w:bottom w:val="single" w:sz="4" w:space="0" w:color="auto"/>
+              <w:right w:val="single" w:sz="4" w:space="0" w:color="auto"/>
+            </w:tcBorders>
+            <w:vAlign w:val="center"/>
+            <w:hideMark/>
+          </w:tcPr>
+          <w:p>
+            <w:pPr>
+              <w:spacing w:after="0" w:line="240" w:lineRule="auto"/>
+              <w:jc w:val="center"/>
+              <w:rPr>
+                <w:rFonts w:ascii="Arial" w:eastAsia="Times New Roman" w:hAnsi="Arial" w:cs="Arial"/>
+                <w:b/>
+                <w:bCs/>
+                <w:color w:val="000000"/>
+                <w:sz w:val="16"/>
+                <w:szCs w:val="16"/>
+              </w:rPr>
+            </w:pPr>
+            <w:r>
+              <w:rPr>
+                <w:rFonts w:ascii="Arial" w:eastAsia="Times New Roman" w:hAnsi="Arial" w:cs="Arial"/>
+                <w:b/>
+                <w:bCs/>
+                <w:color w:val="000000"/>
+                <w:sz w:val="16"/>
+                <w:szCs w:val="16"/>
+              </w:rPr>
+              <w:t>Target Prelist Awal *)</w:t>
+            </w:r>
+          </w:p>
+        </w:tc>
+        <w:tc>
+          <w:tcPr>
+            <w:tcW w:w="284" w:type="pct"/>
+            <w:tcBorders>
+              <w:top w:val="single" w:sz="4" w:space="0" w:color="auto"/>
+              <w:left w:val="nil"/>
+              <w:bottom w:val="single" w:sz="4" w:space="0" w:color="auto"/>
+              <w:right w:val="single" w:sz="4" w:space="0" w:color="auto"/>
+            </w:tcBorders>
+            <w:vAlign w:val="center"/>
+            <w:hideMark/>
+          </w:tcPr>
+          <w:p>
+            <w:pPr>
+              <w:spacing w:after="0" w:line="240" w:lineRule="auto"/>
+              <w:jc w:val="center"/>
+              <w:rPr>
+                <w:rFonts w:ascii="Arial" w:eastAsia="Times New Roman" w:hAnsi="Arial" w:cs="Arial"/>
+                <w:b/>
+                <w:bCs/>
+                <w:color w:val="000000"/>
+                <w:sz w:val="16"/>
+                <w:szCs w:val="16"/>
+              </w:rPr>
+            </w:pPr>
+            <w:proofErr w:type="spellStart"/>
+            <w:r>
+              <w:rPr>
+                <w:rFonts w:ascii="Arial" w:eastAsia="Times New Roman" w:hAnsi="Arial" w:cs="Arial"/>
+                <w:b/>
+                <w:bCs/>
+                <w:color w:val="000000"/>
+                <w:sz w:val="16"/>
+                <w:szCs w:val="16"/>
+              </w:rPr>
+              <w:t>Realisasi</w:t>
+            </w:r>
+            <w:proofErr w:type="spellEnd"/>
+            <w:r>
+              <w:rPr>
+                <w:rFonts w:ascii="Arial" w:eastAsia="Times New Roman" w:hAnsi="Arial" w:cs="Arial"/>
+                <w:b/>
+                <w:bCs/>
+                <w:color w:val="000000"/>
+                <w:sz w:val="16"/>
+                <w:szCs w:val="16"/>
+              </w:rPr>
+              <w:t>*</w:t>
+            </w:r>
+          </w:p>
+        </w:tc>
+        <w:tc>
+          <w:tcPr>
+            <w:tcW w:w="531" w:type="pct"/>
+            <w:vMerge w:val="restart"/>
+            <w:tcBorders>
+              <w:top w:val="single" w:sz="4" w:space="0" w:color="auto"/>
+              <w:left w:val="single" w:sz="4" w:space="0" w:color="auto"/>
+              <w:right w:val="nil"/>
+            </w:tcBorders>
+            <w:vAlign w:val="center"/>
+            <w:hideMark/>
+          </w:tcPr>
+          <w:p>
+            <w:pPr>
+              <w:spacing w:after="0" w:line="240" w:lineRule="auto"/>
+              <w:jc w:val="center"/>
+              <w:rPr>
+                <w:rFonts w:ascii="Arial" w:eastAsia="Times New Roman" w:hAnsi="Arial" w:cs="Arial"/>
+                <w:b/>
+                <w:bCs/>
+                <w:color w:val="000000"/>
+                <w:sz w:val="16"/>
+                <w:szCs w:val="16"/>
+              </w:rPr>
+            </w:pPr>
+            <w:proofErr w:type="spellStart"/>
+            <w:r>
+              <w:rPr>
+                <w:rFonts w:ascii="Arial" w:eastAsia="Times New Roman" w:hAnsi="Arial" w:cs="Arial"/>
+                <w:b/>
+                <w:bCs/>
+                <w:color w:val="000000"/>
+                <w:sz w:val="16"/>
+                <w:szCs w:val="16"/>
+              </w:rPr>
+              <w:t>Persentase</w:t>
+            </w:r>
+            <w:proofErr w:type="spellEnd"/>
+            <w:r>
+              <w:rPr>
+                <w:rFonts w:ascii="Arial" w:eastAsia="Times New Roman" w:hAnsi="Arial" w:cs="Arial"/>
+                <w:b/>
+                <w:bCs/>
+                <w:color w:val="000000"/>
+                <w:sz w:val="16"/>
+                <w:szCs w:val="16"/>
+              </w:rPr>
+              <w:t xml:space="preserve"> (%)</w:t>
+            </w:r>
+          </w:p>
+        </w:tc>
+        <w:tc>
+          <w:tcPr>
+            <w:tcW w:w="318" w:type="pct"/>
+            <w:vMerge w:val="restart"/>
+            <w:tcBorders>
+              <w:top w:val="single" w:sz="4" w:space="0" w:color="auto"/>
+              <w:left w:val="single" w:sz="4" w:space="0" w:color="auto"/>
+              <w:right w:val="single" w:sz="4" w:space="0" w:color="auto"/>
+            </w:tcBorders>
+            <w:noWrap/>
+            <w:vAlign w:val="center"/>
+            <w:hideMark/>
+          </w:tcPr>
+          <w:p>
+            <w:pPr>
+              <w:spacing w:after="0" w:line="240" w:lineRule="auto"/>
+              <w:jc w:val="center"/>
+              <w:rPr>
+                <w:rFonts w:ascii="Arial" w:eastAsia="Times New Roman" w:hAnsi="Arial" w:cs="Arial"/>
+                <w:b/>
+                <w:bCs/>
+                <w:color w:val="000000"/>
+                <w:sz w:val="16"/>
+                <w:szCs w:val="16"/>
+              </w:rPr>
+            </w:pPr>
+            <w:proofErr w:type="spellStart"/>
+            <w:r>
+              <w:rPr>
+                <w:rFonts w:ascii="Arial" w:eastAsia="Times New Roman" w:hAnsi="Arial" w:cs="Arial"/>
+                <w:b/>
+                <w:bCs/>
+                <w:color w:val="000000"/>
+                <w:sz w:val="16"/>
+                <w:szCs w:val="16"/>
+              </w:rPr>
+              <w:t>Keterangan</w:t>
+            </w:r>
+            <w:proofErr w:type="spellEnd"/>
+          </w:p>
+        </w:tc>
+      </w:tr>
+      <w:tr>
+        <w:trPr>
+          <w:trHeight w:val="408"/>
+        </w:trPr>
+        <w:tc>
+          <w:tcPr>
+            <w:tcW w:w="355" w:type="pct"/>
+            <w:vMerge/>
+            <w:tcBorders>
+              <w:top w:val="single" w:sz="4" w:space="0" w:color="auto"/>
+              <w:left w:val="single" w:sz="4" w:space="0" w:color="auto"/>
+              <w:bottom w:val="single" w:sz="4" w:space="0" w:color="000000"/>
+              <w:right w:val="single" w:sz="4" w:space="0" w:color="auto"/>
+            </w:tcBorders>
+            <w:vAlign w:val="center"/>
+            <w:hideMark/>
+          </w:tcPr>
+          <w:p>
+            <w:pPr>
+              <w:spacing w:after="0" w:line="240" w:lineRule="auto"/>
+              <w:rPr>
+                <w:rFonts w:ascii="Arial" w:eastAsia="Times New Roman" w:hAnsi="Arial" w:cs="Arial"/>
+                <w:b/>
+                <w:bCs/>
+                <w:color w:val="000000"/>
+                <w:sz w:val="16"/>
+                <w:szCs w:val="16"/>
+              </w:rPr>
+            </w:pPr>
+          </w:p>
+        </w:tc>
+        <w:tc>
+          <w:tcPr>
+            <w:tcW w:w="396" w:type="pct"/>
+            <w:tcBorders>
+              <w:top w:val="nil"/>
+              <w:left w:val="nil"/>
+              <w:bottom w:val="single" w:sz="4" w:space="0" w:color="auto"/>
+              <w:right w:val="single" w:sz="4" w:space="0" w:color="auto"/>
+            </w:tcBorders>
+            <w:vAlign w:val="center"/>
+            <w:hideMark/>
+          </w:tcPr>
+          <w:p>
+            <w:pPr>
+              <w:spacing w:after="0" w:line="240" w:lineRule="auto"/>
+              <w:jc w:val="center"/>
+              <w:rPr>
+                <w:rFonts w:ascii="Arial" w:eastAsia="Times New Roman" w:hAnsi="Arial" w:cs="Arial"/>
+                <w:b/>
+                <w:bCs/>
+                <w:color w:val="000000"/>
+                <w:sz w:val="16"/>
+                <w:szCs w:val="16"/>
+              </w:rPr>
+            </w:pPr>
+            <w:r>
+              <w:rPr>
+                <w:rFonts w:ascii="Arial" w:eastAsia="Times New Roman" w:hAnsi="Arial" w:cs="Arial"/>
+                <w:b/>
+                <w:bCs/>
+                <w:color w:val="000000"/>
+                <w:sz w:val="16"/>
+                <w:szCs w:val="16"/>
+              </w:rPr>
+              <w:t>Nama</w:t>
+            </w:r>
+          </w:p>
+        </w:tc>
+        <w:tc>
+          <w:tcPr>
+            <w:tcW w:w="391" w:type="pct"/>
+            <w:tcBorders>
+              <w:top w:val="nil"/>
+              <w:left w:val="nil"/>
+              <w:bottom w:val="single" w:sz="4" w:space="0" w:color="auto"/>
+              <w:right w:val="single" w:sz="4" w:space="0" w:color="auto"/>
+            </w:tcBorders>
+            <w:vAlign w:val="center"/>
+            <w:hideMark/>
+          </w:tcPr>
+          <w:p>
+            <w:pPr>
+              <w:spacing w:after="0" w:line="240" w:lineRule="auto"/>
+              <w:jc w:val="center"/>
+              <w:rPr>
+                <w:rFonts w:ascii="Arial" w:eastAsia="Times New Roman" w:hAnsi="Arial" w:cs="Arial"/>
+                <w:b/>
+                <w:bCs/>
+                <w:color w:val="000000"/>
+                <w:sz w:val="16"/>
+                <w:szCs w:val="16"/>
+              </w:rPr>
+            </w:pPr>
+            <w:r>
+              <w:rPr>
+                <w:rFonts w:ascii="Arial" w:eastAsia="Times New Roman" w:hAnsi="Arial" w:cs="Arial"/>
+                <w:b/>
+                <w:bCs/>
+                <w:color w:val="000000"/>
+                <w:sz w:val="16"/>
+                <w:szCs w:val="16"/>
+              </w:rPr>
+              <w:t>Username Sobat</w:t>
+            </w:r>
+          </w:p>
+        </w:tc>
+        <w:tc>
+          <w:tcPr>
+            <w:tcW w:w="298" w:type="pct"/>
+            <w:tcBorders>
+              <w:top w:val="nil"/>
+              <w:left w:val="nil"/>
+              <w:bottom w:val="single" w:sz="4" w:space="0" w:color="auto"/>
+              <w:right w:val="single" w:sz="4" w:space="0" w:color="auto"/>
+            </w:tcBorders>
+            <w:vAlign w:val="center"/>
+            <w:hideMark/>
+          </w:tcPr>
+          <w:p>
+            <w:pPr>
+              <w:spacing w:after="0" w:line="240" w:lineRule="auto"/>
+              <w:jc w:val="center"/>
+              <w:rPr>
+                <w:rFonts w:ascii="Arial" w:eastAsia="Times New Roman" w:hAnsi="Arial" w:cs="Arial"/>
+                <w:b/>
+                <w:bCs/>
+                <w:color w:val="000000"/>
+                <w:sz w:val="16"/>
+                <w:szCs w:val="16"/>
+              </w:rPr>
+            </w:pPr>
+            <w:r>
+              <w:rPr>
+                <w:rFonts w:ascii="Arial" w:eastAsia="Times New Roman" w:hAnsi="Arial" w:cs="Arial"/>
+                <w:b/>
+                <w:bCs/>
+                <w:color w:val="000000"/>
+                <w:sz w:val="16"/>
+                <w:szCs w:val="16"/>
+              </w:rPr>
+              <w:t>Nama</w:t>
+            </w:r>
+          </w:p>
+        </w:tc>
+        <w:tc>
+          <w:tcPr>
+            <w:tcW w:w="294" w:type="pct"/>
+            <w:tcBorders>
+              <w:top w:val="nil"/>
+              <w:left w:val="nil"/>
+              <w:bottom w:val="single" w:sz="4" w:space="0" w:color="auto"/>
+              <w:right w:val="single" w:sz="4" w:space="0" w:color="auto"/>
+            </w:tcBorders>
+            <w:vAlign w:val="center"/>
+            <w:hideMark/>
+          </w:tcPr>
+          <w:p>
+            <w:pPr>
+              <w:spacing w:after="0" w:line="240" w:lineRule="auto"/>
+              <w:jc w:val="center"/>
+              <w:rPr>
+                <w:rFonts w:ascii="Arial" w:eastAsia="Times New Roman" w:hAnsi="Arial" w:cs="Arial"/>
+                <w:b/>
+                <w:bCs/>
+                <w:color w:val="000000"/>
+                <w:sz w:val="16"/>
+                <w:szCs w:val="16"/>
+              </w:rPr>
+            </w:pPr>
+            <w:r>
+              <w:rPr>
+                <w:rFonts w:ascii="Arial" w:eastAsia="Times New Roman" w:hAnsi="Arial" w:cs="Arial"/>
+                <w:b/>
+                <w:bCs/>
+                <w:color w:val="000000"/>
+                <w:sz w:val="16"/>
+                <w:szCs w:val="16"/>
+              </w:rPr>
+              <w:t>Username Sobat</w:t>
+            </w:r>
+          </w:p>
+        </w:tc>
+        <w:tc>
+          <w:tcPr>
+            <w:tcW w:w="439" w:type="pct"/>
+            <w:vMerge/>
+            <w:tcBorders>
+              <w:top w:val="single" w:sz="4" w:space="0" w:color="auto"/>
+              <w:left w:val="single" w:sz="4" w:space="0" w:color="auto"/>
+              <w:bottom w:val="single" w:sz="4" w:space="0" w:color="000000"/>
+              <w:right w:val="single" w:sz="4" w:space="0" w:color="auto"/>
+            </w:tcBorders>
+            <w:vAlign w:val="center"/>
+            <w:hideMark/>
+          </w:tcPr>
+          <w:p>
+            <w:pPr>
+              <w:spacing w:after="0" w:line="240" w:lineRule="auto"/>
+              <w:rPr>
+                <w:rFonts w:ascii="Arial" w:eastAsia="Times New Roman" w:hAnsi="Arial" w:cs="Arial"/>
+                <w:b/>
+                <w:bCs/>
+                <w:color w:val="000000"/>
+                <w:sz w:val="16"/>
+                <w:szCs w:val="16"/>
+              </w:rPr>
+            </w:pPr>
+          </w:p>
+        </w:tc>
+        <w:tc>
+          <w:tcPr>
+            <w:tcW w:w="417" w:type="pct"/>
+            <w:vMerge/>
+            <w:tcBorders>
+              <w:top w:val="single" w:sz="4" w:space="0" w:color="auto"/>
+              <w:left w:val="single" w:sz="4" w:space="0" w:color="auto"/>
+              <w:bottom w:val="single" w:sz="4" w:space="0" w:color="000000"/>
+              <w:right w:val="single" w:sz="4" w:space="0" w:color="auto"/>
+            </w:tcBorders>
+            <w:vAlign w:val="center"/>
+            <w:hideMark/>
+          </w:tcPr>
+          <w:p>
+            <w:pPr>
+              <w:spacing w:after="0" w:line="240" w:lineRule="auto"/>
+              <w:rPr>
+                <w:rFonts w:ascii="Arial" w:eastAsia="Times New Roman" w:hAnsi="Arial" w:cs="Arial"/>
+                <w:b/>
+                <w:bCs/>
+                <w:color w:val="000000"/>
+                <w:sz w:val="16"/>
+                <w:szCs w:val="16"/>
+              </w:rPr>
+            </w:pPr>
+          </w:p>
+        </w:tc>
+        <w:tc>
+          <w:tcPr>
+            <w:tcW w:w="279" w:type="pct"/>
+            <w:vMerge/>
+            <w:tcBorders>
+              <w:top w:val="single" w:sz="4" w:space="0" w:color="auto"/>
+              <w:left w:val="single" w:sz="4" w:space="0" w:color="auto"/>
+              <w:bottom w:val="single" w:sz="4" w:space="0" w:color="000000"/>
+              <w:right w:val="single" w:sz="4" w:space="0" w:color="auto"/>
+            </w:tcBorders>
+            <w:vAlign w:val="center"/>
+            <w:hideMark/>
+          </w:tcPr>
+          <w:p>
+            <w:pPr>
+              <w:spacing w:after="0" w:line="240" w:lineRule="auto"/>
+              <w:rPr>
+                <w:rFonts w:ascii="Arial" w:eastAsia="Times New Roman" w:hAnsi="Arial" w:cs="Arial"/>
+                <w:b/>
+                <w:bCs/>
+                <w:color w:val="000000"/>
+                <w:sz w:val="16"/>
+                <w:szCs w:val="16"/>
+              </w:rPr>
+            </w:pPr>
+          </w:p>
+        </w:tc>
+        <w:tc>
+          <w:tcPr>
+            <w:tcW w:w="361" w:type="pct"/>
+            <w:tcBorders>
+              <w:top w:val="nil"/>
+              <w:left w:val="nil"/>
+              <w:bottom w:val="single" w:sz="4" w:space="0" w:color="auto"/>
+              <w:right w:val="single" w:sz="4" w:space="0" w:color="auto"/>
+            </w:tcBorders>
+            <w:vAlign w:val="center"/>
+            <w:hideMark/>
+          </w:tcPr>
+          <w:p>
+            <w:pPr>
+              <w:spacing w:after="0" w:line="240" w:lineRule="auto"/>
+              <w:jc w:val="center"/>
+              <w:rPr>
+                <w:rFonts w:ascii="Arial" w:eastAsia="Times New Roman" w:hAnsi="Arial" w:cs="Arial"/>
+                <w:b/>
+                <w:bCs/>
+                <w:color w:val="000000"/>
+                <w:sz w:val="16"/>
+                <w:szCs w:val="16"/>
+              </w:rPr>
+            </w:pPr>
+            <w:proofErr w:type="spellStart"/>
+            <w:r>
+              <w:rPr>
+                <w:rFonts w:ascii="Arial" w:eastAsia="Times New Roman" w:hAnsi="Arial" w:cs="Arial"/>
+                <w:b/>
+                <w:bCs/>
+                <w:color w:val="000000"/>
+                <w:sz w:val="16"/>
+                <w:szCs w:val="16"/>
+              </w:rPr>
+              <w:t>Keluarga</w:t>
+            </w:r>
+            <w:proofErr w:type="spellEnd"/>
+          </w:p>
+        </w:tc>
+        <w:tc>
+          <w:tcPr>
+            <w:tcW w:w="313" w:type="pct"/>
+            <w:tcBorders>
+              <w:top w:val="nil"/>
+              <w:left w:val="nil"/>
+              <w:bottom w:val="single" w:sz="4" w:space="0" w:color="auto"/>
+              <w:right w:val="single" w:sz="4" w:space="0" w:color="auto"/>
+            </w:tcBorders>
+            <w:vAlign w:val="center"/>
+            <w:hideMark/>
+          </w:tcPr>
+          <w:p>
+            <w:pPr>
+              <w:spacing w:after="0" w:line="240" w:lineRule="auto"/>
+              <w:jc w:val="center"/>
+              <w:rPr>
+                <w:rFonts w:ascii="Arial" w:eastAsia="Times New Roman" w:hAnsi="Arial" w:cs="Arial"/>
+                <w:b/>
+                <w:bCs/>
+                <w:color w:val="000000"/>
+                <w:sz w:val="16"/>
+                <w:szCs w:val="16"/>
+              </w:rPr>
+            </w:pPr>
+            <w:r>
+              <w:rPr>
+                <w:rFonts w:ascii="Arial" w:eastAsia="Times New Roman" w:hAnsi="Arial" w:cs="Arial"/>
+                <w:b/>
+                <w:bCs/>
+                <w:color w:val="000000"/>
+                <w:sz w:val="16"/>
+                <w:szCs w:val="16"/>
+              </w:rPr>
+              <w:t>Usaha</w:t>
+            </w:r>
+          </w:p>
+        </w:tc>
+        <w:tc>
+          <w:tcPr>
+            <w:tcW w:w="323" w:type="pct"/>
+            <w:tcBorders>
+              <w:top w:val="nil"/>
+              <w:left w:val="nil"/>
+              <w:bottom w:val="single" w:sz="4" w:space="0" w:color="auto"/>
+              <w:right w:val="single" w:sz="4" w:space="0" w:color="auto"/>
+            </w:tcBorders>
+            <w:vAlign w:val="center"/>
+            <w:hideMark/>
+          </w:tcPr>
+          <w:p>
+            <w:pPr>
+              <w:spacing w:after="0" w:line="240" w:lineRule="auto"/>
+              <w:jc w:val="center"/>
+              <w:rPr>
+                <w:rFonts w:ascii="Arial" w:eastAsia="Times New Roman" w:hAnsi="Arial" w:cs="Arial"/>
+                <w:b/>
+                <w:bCs/>
+                <w:color w:val="000000"/>
+                <w:sz w:val="16"/>
+                <w:szCs w:val="16"/>
+              </w:rPr>
+            </w:pPr>
+            <w:proofErr w:type="spellStart"/>
+            <w:r>
+              <w:rPr>
+                <w:rFonts w:ascii="Arial" w:eastAsia="Times New Roman" w:hAnsi="Arial" w:cs="Arial"/>
+                <w:b/>
+                <w:bCs/>
+                <w:color w:val="000000"/>
+                <w:sz w:val="16"/>
+                <w:szCs w:val="16"/>
+              </w:rPr>
+              <w:t>Jumlah</w:t>
+            </w:r>
+            <w:proofErr w:type="spellEnd"/>
+          </w:p>
+        </w:tc>
+        <w:tc>
+          <w:tcPr>
+            <w:tcW w:w="284" w:type="pct"/>
+            <w:tcBorders>
+              <w:top w:val="nil"/>
+              <w:left w:val="nil"/>
+              <w:bottom w:val="single" w:sz="4" w:space="0" w:color="auto"/>
+              <w:right w:val="single" w:sz="4" w:space="0" w:color="auto"/>
+            </w:tcBorders>
+            <w:vAlign w:val="center"/>
+            <w:hideMark/>
+          </w:tcPr>
+          <w:p>
+            <w:pPr>
+              <w:spacing w:after="0" w:line="240" w:lineRule="auto"/>
+              <w:jc w:val="center"/>
+              <w:rPr>
+                <w:rFonts w:ascii="Arial" w:eastAsia="Times New Roman" w:hAnsi="Arial" w:cs="Arial"/>
+                <w:b/>
+                <w:bCs/>
+                <w:color w:val="000000"/>
+                <w:sz w:val="16"/>
+                <w:szCs w:val="16"/>
+              </w:rPr>
+            </w:pPr>
+            <w:proofErr w:type="spellStart"/>
+            <w:r>
+              <w:rPr>
+                <w:rFonts w:ascii="Arial" w:eastAsia="Times New Roman" w:hAnsi="Arial" w:cs="Arial"/>
+                <w:b/>
+                <w:bCs/>
+                <w:color w:val="000000"/>
+                <w:sz w:val="16"/>
+                <w:szCs w:val="16"/>
+              </w:rPr>
+              <w:t>Jumlah</w:t>
+            </w:r>
+            <w:proofErr w:type="spellEnd"/>
+          </w:p>
+        </w:tc>
+        <w:tc>
+          <w:tcPr>
+            <w:tcW w:w="531" w:type="pct"/>
+            <w:vMerge/>
+            <w:tcBorders>
+              <w:left w:val="single" w:sz="4" w:space="0" w:color="auto"/>
+              <w:bottom w:val="single" w:sz="4" w:space="0" w:color="000000"/>
+              <w:right w:val="nil"/>
+            </w:tcBorders>
+            <w:vAlign w:val="center"/>
+            <w:hideMark/>
+          </w:tcPr>
+          <w:p>
+            <w:pPr>
+              <w:spacing w:after="0" w:line="240" w:lineRule="auto"/>
+              <w:rPr>
+                <w:rFonts w:ascii="Arial" w:eastAsia="Times New Roman" w:hAnsi="Arial" w:cs="Arial"/>
+                <w:b/>
+                <w:bCs/>
+                <w:color w:val="000000"/>
+                <w:sz w:val="16"/>
+                <w:szCs w:val="16"/>
+              </w:rPr>
+            </w:pPr>
+          </w:p>
+        </w:tc>
+        <w:tc>
+          <w:tcPr>
+            <w:tcW w:w="318" w:type="pct"/>
+            <w:vMerge/>
+            <w:tcBorders>
+              <w:left w:val="single" w:sz="4" w:space="0" w:color="auto"/>
+              <w:bottom w:val="single" w:sz="4" w:space="0" w:color="000000"/>
+              <w:right w:val="single" w:sz="4" w:space="0" w:color="auto"/>
+            </w:tcBorders>
+            <w:vAlign w:val="center"/>
+            <w:hideMark/>
+          </w:tcPr>
+          <w:p>
+            <w:pPr>
+              <w:spacing w:after="0" w:line="240" w:lineRule="auto"/>
+              <w:rPr>
+                <w:rFonts w:ascii="Arial" w:eastAsia="Times New Roman" w:hAnsi="Arial" w:cs="Arial"/>
+                <w:b/>
+                <w:bCs/>
+                <w:color w:val="000000"/>
+                <w:sz w:val="16"/>
+                <w:szCs w:val="16"/>
+              </w:rPr>
+            </w:pPr>
+          </w:p>
+        </w:tc>
+      </w:tr>
+      <w:tr>
+        <w:trPr>
+          <w:trHeight w:val="276"/>
+        </w:trPr>
+        <w:tc>
+          <w:tcPr>
+            <w:tcW w:w="355" w:type="pct"/>
+            <w:tcBorders>
+              <w:top w:val="nil"/>
+              <w:left w:val="single" w:sz="4" w:space="0" w:color="auto"/>
+              <w:bottom w:val="single" w:sz="4" w:space="0" w:color="auto"/>
+              <w:right w:val="single" w:sz="4" w:space="0" w:color="auto"/>
+            </w:tcBorders>
+            <w:vAlign w:val="center"/>
+            <w:hideMark/>
+          </w:tcPr>
+          <w:p>
+            <w:pPr>
+              <w:spacing w:after="0" w:line="240" w:lineRule="auto"/>
+              <w:jc w:val="center"/>
+              <w:rPr>
+                <w:rFonts w:ascii="Arial" w:eastAsia="Times New Roman" w:hAnsi="Arial" w:cs="Arial"/>
+                <w:b/>
+                <w:bCs/>
+                <w:color w:val="000000"/>
+                <w:sz w:val="16"/>
+                <w:szCs w:val="16"/>
+              </w:rPr>
+            </w:pPr>
+            <w:r>
+              <w:rPr>
+                <w:rFonts w:ascii="Arial" w:eastAsia="Times New Roman" w:hAnsi="Arial" w:cs="Arial"/>
+                <w:b/>
+                <w:bCs/>
+                <w:color w:val="000000"/>
+                <w:sz w:val="16"/>
+                <w:szCs w:val="16"/>
+              </w:rPr>
+              <w:t>(1)</w:t>
+            </w:r>
+          </w:p>
+        </w:tc>
+        <w:tc>
+          <w:tcPr>
+            <w:tcW w:w="396" w:type="pct"/>
+            <w:tcBorders>
+              <w:top w:val="nil"/>
+              <w:left w:val="nil"/>
+              <w:bottom w:val="single" w:sz="4" w:space="0" w:color="auto"/>
+              <w:right w:val="single" w:sz="4" w:space="0" w:color="auto"/>
+            </w:tcBorders>
+            <w:vAlign w:val="center"/>
+            <w:hideMark/>
+          </w:tcPr>
+          <w:p>
+            <w:pPr>
+              <w:spacing w:after="0" w:line="240" w:lineRule="auto"/>
+              <w:jc w:val="center"/>
+              <w:rPr>
+                <w:rFonts w:ascii="Arial" w:eastAsia="Times New Roman" w:hAnsi="Arial" w:cs="Arial"/>
+                <w:b/>
+                <w:bCs/>
+                <w:color w:val="000000"/>
+                <w:sz w:val="16"/>
+                <w:szCs w:val="16"/>
+              </w:rPr>
+            </w:pPr>
+            <w:r>
+              <w:rPr>
+                <w:rFonts w:ascii="Arial" w:eastAsia="Times New Roman" w:hAnsi="Arial" w:cs="Arial"/>
+                <w:b/>
+                <w:bCs/>
+                <w:color w:val="000000"/>
+                <w:sz w:val="16"/>
+                <w:szCs w:val="16"/>
+              </w:rPr>
+              <w:t>(2)</w:t>
+            </w:r>
+          </w:p>
+        </w:tc>
+        <w:tc>
+          <w:tcPr>
+            <w:tcW w:w="391" w:type="pct"/>
+            <w:tcBorders>
+              <w:top w:val="nil"/>
+              <w:left w:val="nil"/>
+              <w:bottom w:val="single" w:sz="4" w:space="0" w:color="auto"/>
+              <w:right w:val="single" w:sz="4" w:space="0" w:color="auto"/>
+            </w:tcBorders>
+            <w:vAlign w:val="center"/>
+            <w:hideMark/>
+          </w:tcPr>
+          <w:p>
+            <w:pPr>
+              <w:spacing w:after="0" w:line="240" w:lineRule="auto"/>
+              <w:jc w:val="center"/>
+              <w:rPr>
+                <w:rFonts w:ascii="Arial" w:eastAsia="Times New Roman" w:hAnsi="Arial" w:cs="Arial"/>
+                <w:b/>
+                <w:bCs/>
+                <w:color w:val="000000"/>
+                <w:sz w:val="16"/>
+                <w:szCs w:val="16"/>
+              </w:rPr>
+            </w:pPr>
+            <w:r>
+              <w:rPr>
+                <w:rFonts w:ascii="Arial" w:eastAsia="Times New Roman" w:hAnsi="Arial" w:cs="Arial"/>
+                <w:b/>
+                <w:bCs/>
+                <w:color w:val="000000"/>
+                <w:sz w:val="16"/>
+                <w:szCs w:val="16"/>
+              </w:rPr>
+              <w:t>(3)</w:t>
+            </w:r>
+          </w:p>
+        </w:tc>
+        <w:tc>
+          <w:tcPr>
+            <w:tcW w:w="298" w:type="pct"/>
+            <w:tcBorders>
+              <w:top w:val="nil"/>
+              <w:left w:val="nil"/>
+              <w:bottom w:val="single" w:sz="4" w:space="0" w:color="auto"/>
+              <w:right w:val="single" w:sz="4" w:space="0" w:color="auto"/>
+            </w:tcBorders>
+            <w:vAlign w:val="center"/>
+            <w:hideMark/>
+          </w:tcPr>
+          <w:p>
+            <w:pPr>
+              <w:spacing w:after="0" w:line="240" w:lineRule="auto"/>
+              <w:jc w:val="center"/>
+              <w:rPr>
+                <w:rFonts w:ascii="Arial" w:eastAsia="Times New Roman" w:hAnsi="Arial" w:cs="Arial"/>
+                <w:b/>
+                <w:bCs/>
+                <w:color w:val="000000"/>
+                <w:sz w:val="16"/>
+                <w:szCs w:val="16"/>
+              </w:rPr>
+            </w:pPr>
+            <w:r>
+              <w:rPr>
+                <w:rFonts w:ascii="Arial" w:eastAsia="Times New Roman" w:hAnsi="Arial" w:cs="Arial"/>
+                <w:b/>
+                <w:bCs/>
+                <w:color w:val="000000"/>
+                <w:sz w:val="16"/>
+                <w:szCs w:val="16"/>
+              </w:rPr>
+              <w:t>(4)</w:t>
+            </w:r>
+          </w:p>
+        </w:tc>
+        <w:tc>
+          <w:tcPr>
+            <w:tcW w:w="294" w:type="pct"/>
+            <w:tcBorders>
+              <w:top w:val="nil"/>
+              <w:left w:val="nil"/>
+              <w:bottom w:val="single" w:sz="4" w:space="0" w:color="auto"/>
+              <w:right w:val="single" w:sz="4" w:space="0" w:color="auto"/>
+            </w:tcBorders>
+            <w:vAlign w:val="center"/>
+            <w:hideMark/>
+          </w:tcPr>
+          <w:p>
+            <w:pPr>
+              <w:spacing w:after="0" w:line="240" w:lineRule="auto"/>
+              <w:jc w:val="center"/>
+              <w:rPr>
+                <w:rFonts w:ascii="Arial" w:eastAsia="Times New Roman" w:hAnsi="Arial" w:cs="Arial"/>
+                <w:b/>
+                <w:bCs/>
+                <w:color w:val="000000"/>
+                <w:sz w:val="16"/>
+                <w:szCs w:val="16"/>
+              </w:rPr>
+            </w:pPr>
+            <w:r>
+              <w:rPr>
+                <w:rFonts w:ascii="Arial" w:eastAsia="Times New Roman" w:hAnsi="Arial" w:cs="Arial"/>
+                <w:b/>
+                <w:bCs/>
+                <w:color w:val="000000"/>
+                <w:sz w:val="16"/>
+                <w:szCs w:val="16"/>
+              </w:rPr>
+              <w:t>(5)</w:t>
+            </w:r>
+          </w:p>
+        </w:tc>
+        <w:tc>
+          <w:tcPr>
+            <w:tcW w:w="439" w:type="pct"/>
+            <w:tcBorders>
+              <w:top w:val="nil"/>
+              <w:left w:val="nil"/>
+              <w:bottom w:val="single" w:sz="4" w:space="0" w:color="auto"/>
+              <w:right w:val="single" w:sz="4" w:space="0" w:color="auto"/>
+            </w:tcBorders>
+            <w:vAlign w:val="center"/>
+            <w:hideMark/>
+          </w:tcPr>
+          <w:p>
+            <w:pPr>
+              <w:spacing w:after="0" w:line="240" w:lineRule="auto"/>
+              <w:jc w:val="center"/>
+              <w:rPr>
+                <w:rFonts w:ascii="Arial" w:eastAsia="Times New Roman" w:hAnsi="Arial" w:cs="Arial"/>
+                <w:b/>
+                <w:bCs/>
+                <w:color w:val="000000"/>
+                <w:sz w:val="16"/>
+                <w:szCs w:val="16"/>
+              </w:rPr>
+            </w:pPr>
+            <w:r>
+              <w:rPr>
+                <w:rFonts w:ascii="Arial" w:eastAsia="Times New Roman" w:hAnsi="Arial" w:cs="Arial"/>
+                <w:b/>
+                <w:bCs/>
+                <w:color w:val="000000"/>
+                <w:sz w:val="16"/>
+                <w:szCs w:val="16"/>
+              </w:rPr>
+              <w:t>(6)</w:t>
+            </w:r>
+          </w:p>
+        </w:tc>
+        <w:tc>
+          <w:tcPr>
+            <w:tcW w:w="417" w:type="pct"/>
+            <w:tcBorders>
+              <w:top w:val="nil"/>
+              <w:left w:val="nil"/>
+              <w:bottom w:val="single" w:sz="4" w:space="0" w:color="auto"/>
+              <w:right w:val="single" w:sz="4" w:space="0" w:color="auto"/>
+            </w:tcBorders>
+            <w:vAlign w:val="center"/>
+            <w:hideMark/>
+          </w:tcPr>
+          <w:p>
+            <w:pPr>
+              <w:spacing w:after="0" w:line="240" w:lineRule="auto"/>
+              <w:jc w:val="center"/>
+              <w:rPr>
+                <w:rFonts w:ascii="Arial" w:eastAsia="Times New Roman" w:hAnsi="Arial" w:cs="Arial"/>
+                <w:b/>
+                <w:bCs/>
+                <w:color w:val="000000"/>
+                <w:sz w:val="16"/>
+                <w:szCs w:val="16"/>
+              </w:rPr>
+            </w:pPr>
+            <w:r>
+              <w:rPr>
+                <w:rFonts w:ascii="Arial" w:eastAsia="Times New Roman" w:hAnsi="Arial" w:cs="Arial"/>
+                <w:b/>
+                <w:bCs/>
+                <w:color w:val="000000"/>
+                <w:sz w:val="16"/>
+                <w:szCs w:val="16"/>
+              </w:rPr>
+              <w:t>(7)</w:t>
+            </w:r>
+          </w:p>
+        </w:tc>
+        <w:tc>
+          <w:tcPr>
+            <w:tcW w:w="279" w:type="pct"/>
+            <w:tcBorders>
+              <w:top w:val="nil"/>
+              <w:left w:val="nil"/>
+              <w:bottom w:val="single" w:sz="4" w:space="0" w:color="auto"/>
+              <w:right w:val="single" w:sz="4" w:space="0" w:color="auto"/>
+            </w:tcBorders>
+            <w:vAlign w:val="center"/>
+            <w:hideMark/>
+          </w:tcPr>
+          <w:p>
+            <w:pPr>
+              <w:spacing w:after="0" w:line="240" w:lineRule="auto"/>
+              <w:jc w:val="center"/>
+              <w:rPr>
+                <w:rFonts w:ascii="Arial" w:eastAsia="Times New Roman" w:hAnsi="Arial" w:cs="Arial"/>
+                <w:b/>
+                <w:bCs/>
+                <w:color w:val="000000"/>
+                <w:sz w:val="16"/>
+                <w:szCs w:val="16"/>
+              </w:rPr>
+            </w:pPr>
+            <w:r>
+              <w:rPr>
+                <w:rFonts w:ascii="Arial" w:eastAsia="Times New Roman" w:hAnsi="Arial" w:cs="Arial"/>
+                <w:b/>
+                <w:bCs/>
+                <w:color w:val="000000"/>
+                <w:sz w:val="16"/>
+                <w:szCs w:val="16"/>
+              </w:rPr>
+              <w:t>(8)</w:t>
+            </w:r>
+          </w:p>
+        </w:tc>
+        <w:tc>
+          <w:tcPr>
+            <w:tcW w:w="361" w:type="pct"/>
+            <w:tcBorders>
+              <w:top w:val="nil"/>
+              <w:left w:val="nil"/>
+              <w:bottom w:val="single" w:sz="4" w:space="0" w:color="auto"/>
+              <w:right w:val="single" w:sz="4" w:space="0" w:color="auto"/>
+            </w:tcBorders>
+            <w:vAlign w:val="center"/>
+            <w:hideMark/>
+          </w:tcPr>
+          <w:p>
+            <w:pPr>
+              <w:spacing w:after="0" w:line="240" w:lineRule="auto"/>
+              <w:jc w:val="center"/>
+              <w:rPr>
+                <w:rFonts w:ascii="Arial" w:eastAsia="Times New Roman" w:hAnsi="Arial" w:cs="Arial"/>
+                <w:b/>
+                <w:bCs/>
+                <w:color w:val="000000"/>
+                <w:sz w:val="16"/>
+                <w:szCs w:val="16"/>
+              </w:rPr>
+            </w:pPr>
+            <w:r>
+              <w:rPr>
+                <w:rFonts w:ascii="Arial" w:eastAsia="Times New Roman" w:hAnsi="Arial" w:cs="Arial"/>
+                <w:b/>
+                <w:bCs/>
+                <w:color w:val="000000"/>
+                <w:sz w:val="16"/>
+                <w:szCs w:val="16"/>
+              </w:rPr>
+              <w:t>(9)</w:t>
+            </w:r>
+          </w:p>
+        </w:tc>
+        <w:tc>
+          <w:tcPr>
+            <w:tcW w:w="313" w:type="pct"/>
+            <w:tcBorders>
+              <w:top w:val="nil"/>
+              <w:left w:val="nil"/>
+              <w:bottom w:val="single" w:sz="4" w:space="0" w:color="auto"/>
+              <w:right w:val="single" w:sz="4" w:space="0" w:color="auto"/>
+            </w:tcBorders>
+            <w:vAlign w:val="center"/>
+            <w:hideMark/>
+          </w:tcPr>
+          <w:p>
+            <w:pPr>
+              <w:spacing w:after="0" w:line="240" w:lineRule="auto"/>
+              <w:jc w:val="center"/>
+              <w:rPr>
+                <w:rFonts w:ascii="Arial" w:eastAsia="Times New Roman" w:hAnsi="Arial" w:cs="Arial"/>
+                <w:b/>
+                <w:bCs/>
+                <w:color w:val="000000"/>
+                <w:sz w:val="16"/>
+                <w:szCs w:val="16"/>
+              </w:rPr>
+            </w:pPr>
+            <w:r>
+              <w:rPr>
+                <w:rFonts w:ascii="Arial" w:eastAsia="Times New Roman" w:hAnsi="Arial" w:cs="Arial"/>
+                <w:b/>
+                <w:bCs/>
+                <w:color w:val="000000"/>
+                <w:sz w:val="16"/>
+                <w:szCs w:val="16"/>
+              </w:rPr>
+              <w:t>(10)</w:t>
+            </w:r>
+          </w:p>
+        </w:tc>
+        <w:tc>
+          <w:tcPr>
+            <w:tcW w:w="323" w:type="pct"/>
+            <w:tcBorders>
+              <w:top w:val="nil"/>
+              <w:left w:val="nil"/>
+              <w:bottom w:val="single" w:sz="4" w:space="0" w:color="auto"/>
+              <w:right w:val="single" w:sz="4" w:space="0" w:color="auto"/>
+            </w:tcBorders>
+            <w:vAlign w:val="center"/>
+            <w:hideMark/>
+          </w:tcPr>
+          <w:p>
+            <w:pPr>
+              <w:spacing w:after="0" w:line="240" w:lineRule="auto"/>
+              <w:jc w:val="center"/>
+              <w:rPr>
+                <w:rFonts w:ascii="Arial" w:eastAsia="Times New Roman" w:hAnsi="Arial" w:cs="Arial"/>
+                <w:b/>
+                <w:bCs/>
+                <w:color w:val="000000"/>
+                <w:sz w:val="16"/>
+                <w:szCs w:val="16"/>
+              </w:rPr>
+            </w:pPr>
+            <w:r>
+              <w:rPr>
+                <w:rFonts w:ascii="Arial" w:eastAsia="Times New Roman" w:hAnsi="Arial" w:cs="Arial"/>
+                <w:b/>
+                <w:bCs/>
+                <w:color w:val="000000"/>
+                <w:sz w:val="16"/>
+                <w:szCs w:val="16"/>
+              </w:rPr>
+              <w:t>(11)</w:t>
+            </w:r>
+          </w:p>
+        </w:tc>
+        <w:tc>
+          <w:tcPr>
+            <w:tcW w:w="284" w:type="pct"/>
+            <w:tcBorders>
+              <w:top w:val="nil"/>
+              <w:left w:val="nil"/>
+              <w:bottom w:val="single" w:sz="4" w:space="0" w:color="auto"/>
+              <w:right w:val="single" w:sz="4" w:space="0" w:color="auto"/>
+            </w:tcBorders>
+            <w:vAlign w:val="center"/>
+            <w:hideMark/>
+          </w:tcPr>
+          <w:p>
+            <w:pPr>
+              <w:spacing w:after="0" w:line="240" w:lineRule="auto"/>
+              <w:jc w:val="center"/>
+              <w:rPr>
+                <w:rFonts w:ascii="Arial" w:eastAsia="Times New Roman" w:hAnsi="Arial" w:cs="Arial"/>
+                <w:b/>
+                <w:bCs/>
+                <w:color w:val="000000"/>
+                <w:sz w:val="16"/>
+                <w:szCs w:val="16"/>
+              </w:rPr>
+            </w:pPr>
+            <w:r>
+              <w:rPr>
+                <w:rFonts w:ascii="Arial" w:eastAsia="Times New Roman" w:hAnsi="Arial" w:cs="Arial"/>
+                <w:b/>
+                <w:bCs/>
+                <w:color w:val="000000"/>
+                <w:sz w:val="16"/>
+                <w:szCs w:val="16"/>
+              </w:rPr>
+              <w:t>(12)</w:t>
+            </w:r>
+          </w:p>
+        </w:tc>
+        <w:tc>
+          <w:tcPr>
+            <w:tcW w:w="531" w:type="pct"/>
+            <w:tcBorders>
+              <w:top w:val="nil"/>
+              <w:left w:val="nil"/>
+              <w:bottom w:val="single" w:sz="4" w:space="0" w:color="auto"/>
+              <w:right w:val="single" w:sz="4" w:space="0" w:color="auto"/>
+            </w:tcBorders>
+            <w:vAlign w:val="center"/>
+            <w:hideMark/>
+          </w:tcPr>
+          <w:p>
+            <w:pPr>
+              <w:spacing w:after="0" w:line="240" w:lineRule="auto"/>
+              <w:jc w:val="center"/>
+              <w:rPr>
+                <w:rFonts w:ascii="Arial" w:eastAsia="Times New Roman" w:hAnsi="Arial" w:cs="Arial"/>
+                <w:b/>
+                <w:bCs/>
+                <w:color w:val="000000"/>
+                <w:sz w:val="16"/>
+                <w:szCs w:val="16"/>
+              </w:rPr>
+            </w:pPr>
+            <w:r>
+              <w:rPr>
+                <w:rFonts w:ascii="Arial" w:eastAsia="Times New Roman" w:hAnsi="Arial" w:cs="Arial"/>
+                <w:b/>
+                <w:bCs/>
+                <w:color w:val="000000"/>
+                <w:sz w:val="16"/>
+                <w:szCs w:val="16"/>
+              </w:rPr>
+              <w:t>(</w:t>
+            </w:r>
+            <w:proofErr w:type="gramStart"/>
+            <w:r>
+              <w:rPr>
+                <w:rFonts w:ascii="Arial" w:eastAsia="Times New Roman" w:hAnsi="Arial" w:cs="Arial"/>
+                <w:b/>
+                <w:bCs/>
+                <w:color w:val="000000"/>
+                <w:sz w:val="16"/>
+                <w:szCs w:val="16"/>
+              </w:rPr>
+              <w:t>15)=</w:t>
+            </w:r>
+            <w:proofErr w:type="gramEnd"/>
+            <w:r>
+              <w:rPr>
+                <w:rFonts w:ascii="Arial" w:eastAsia="Times New Roman" w:hAnsi="Arial" w:cs="Arial"/>
+                <w:b/>
+                <w:bCs/>
+                <w:color w:val="000000"/>
+                <w:sz w:val="16"/>
+                <w:szCs w:val="16"/>
+              </w:rPr>
+              <w:t>(14)</w:t>
+            </w:r>
+            <w:proofErr w:type="gramStart"/>
+            <w:r>
+              <w:rPr>
+                <w:rFonts w:ascii="Arial" w:eastAsia="Times New Roman" w:hAnsi="Arial" w:cs="Arial"/>
+                <w:b/>
+                <w:bCs/>
+                <w:color w:val="000000"/>
+                <w:sz w:val="16"/>
+                <w:szCs w:val="16"/>
+              </w:rPr>
+              <w:t>/(</w:t>
+            </w:r>
+            <w:proofErr w:type="gramEnd"/>
+            <w:r>
+              <w:rPr>
+                <w:rFonts w:ascii="Arial" w:eastAsia="Times New Roman" w:hAnsi="Arial" w:cs="Arial"/>
+                <w:b/>
+                <w:bCs/>
+                <w:color w:val="000000"/>
+                <w:sz w:val="16"/>
+                <w:szCs w:val="16"/>
+              </w:rPr>
+              <w:t>11)</w:t>
+            </w:r>
+          </w:p>
+        </w:tc>
+        <w:tc>
+          <w:tcPr>
+            <w:tcW w:w="318" w:type="pct"/>
+            <w:tcBorders>
+              <w:top w:val="nil"/>
+              <w:left w:val="nil"/>
+              <w:bottom w:val="single" w:sz="4" w:space="0" w:color="auto"/>
+              <w:right w:val="single" w:sz="4" w:space="0" w:color="auto"/>
+            </w:tcBorders>
+            <w:vAlign w:val="center"/>
+            <w:hideMark/>
+          </w:tcPr>
+          <w:p>
+            <w:pPr>
+              <w:spacing w:after="0" w:line="240" w:lineRule="auto"/>
+              <w:jc w:val="center"/>
+              <w:rPr>
+                <w:rFonts w:ascii="Arial" w:eastAsia="Times New Roman" w:hAnsi="Arial" w:cs="Arial"/>
+                <w:b/>
+                <w:bCs/>
+                <w:color w:val="000000"/>
+                <w:sz w:val="16"/>
+                <w:szCs w:val="16"/>
+              </w:rPr>
+            </w:pPr>
+            <w:r>
+              <w:rPr>
+                <w:rFonts w:ascii="Arial" w:eastAsia="Times New Roman" w:hAnsi="Arial" w:cs="Arial"/>
+                <w:b/>
+                <w:bCs/>
+                <w:color w:val="000000"/>
+                <w:sz w:val="16"/>
+                <w:szCs w:val="16"/>
+              </w:rPr>
+              <w:t>(18)</w:t>
+            </w:r>
+          </w:p>
+        </w:tc>
+      </w:tr>
+      <w:tr>
+        <w:trPr>
+          <w:trHeight w:val="300"/>
+        </w:trPr>
+        <w:tc>
+          <w:tcPr>
+            <w:tcW w:w="355" w:type="pct"/>
+            <w:tcBorders>
+              <w:top w:val="nil"/>
+              <w:left w:val="single" w:sz="4" w:space="0" w:color="auto"/>
+              <w:bottom w:val="single" w:sz="4" w:space="0" w:color="auto"/>
+              <w:right w:val="single" w:sz="4" w:space="0" w:color="auto"/>
+            </w:tcBorders>
+            <w:vAlign w:val="center"/>
+          </w:tcPr>
+          <w:p>
+            <w:pPr>
+              <w:spacing w:after="0" w:line="240" w:lineRule="auto"/>
+              <w:jc w:val="center"/>
+              <w:rPr>
+                <w:rFonts w:ascii="Arial" w:eastAsia="Times New Roman" w:hAnsi="Arial" w:cs="Arial"/>
+                <w:color w:val="000000"/>
+                <w:sz w:val="16"/>
+                <w:szCs w:val="16"/>
+              </w:rPr>
+            </w:pPr>
+            <w:r>
+              <w:rPr>
+                <w:rFonts w:ascii="Arial" w:eastAsia="Times New Roman" w:hAnsi="Arial" w:cs="Arial"/>
+                <w:color w:val="000000"/>
+                <w:sz w:val="16"/>
+                <w:szCs w:val="16"/>
+              </w:rPr>
+              <w:t>{#</w:t>
+            </w:r>
+            <w:proofErr w:type="gramStart"/>
+            <w:r>
+              <w:rPr>
+                <w:rFonts w:ascii="Arial" w:eastAsia="Times New Roman" w:hAnsi="Arial" w:cs="Arial"/>
+                <w:color w:val="000000"/>
+                <w:sz w:val="16"/>
+                <w:szCs w:val="16"/>
+              </w:rPr>
+              <w:t>peserta}{</w:t>
+            </w:r>
+            <w:proofErr w:type="gramEnd"/>
+            <w:r>
+              <w:rPr>
+                <w:rFonts w:ascii="Arial" w:eastAsia="Times New Roman" w:hAnsi="Arial" w:cs="Arial"/>
+                <w:color w:val="000000"/>
+                <w:sz w:val="16"/>
+                <w:szCs w:val="16"/>
+              </w:rPr>
+              <w:t>no}</w:t>
+            </w:r>
+          </w:p>
+        </w:tc>
+        <w:tc>
+          <w:tcPr>
+            <w:tcW w:w="396" w:type="pct"/>
+            <w:tcBorders>
+              <w:top w:val="nil"/>
+              <w:left w:val="nil"/>
+              <w:bottom w:val="single" w:sz="4" w:space="0" w:color="auto"/>
+              <w:right w:val="single" w:sz="4" w:space="0" w:color="auto"/>
+            </w:tcBorders>
+            <w:vAlign w:val="center"/>
+          </w:tcPr>
+          <w:p>
+            <w:pPr>
+              <w:spacing w:after="0" w:line="240" w:lineRule="auto"/>
+              <w:rPr>
+                <w:rFonts w:ascii="Arial" w:eastAsia="Times New Roman" w:hAnsi="Arial" w:cs="Arial"/>
+                <w:color w:val="000000"/>
+                <w:sz w:val="16"/>
+                <w:szCs w:val="16"/>
+              </w:rPr>
+            </w:pPr>
+            <w:r>
+              <w:rPr>
+                <w:rFonts w:ascii="Arial" w:eastAsia="Times New Roman" w:hAnsi="Arial" w:cs="Arial"/>
+                <w:color w:val="000000"/>
+                <w:sz w:val="16"/>
+                <w:szCs w:val="16"/>
+              </w:rPr>
+              <w:t>{</w:t>
+            </w:r>
+            <w:proofErr w:type="spellStart"/>
+            <w:r>
+              <w:rPr>
+                <w:rFonts w:ascii="Arial" w:eastAsia="Times New Roman" w:hAnsi="Arial" w:cs="Arial"/>
+                <w:color w:val="000000"/>
+                <w:sz w:val="16"/>
+                <w:szCs w:val="16"/>
+              </w:rPr>
+              <w:t>nama_petugas</w:t>
+            </w:r>
+            <w:proofErr w:type="spellEnd"/>
+            <w:r>
+              <w:rPr>
+                <w:rFonts w:ascii="Arial" w:eastAsia="Times New Roman" w:hAnsi="Arial" w:cs="Arial"/>
+                <w:color w:val="000000"/>
+                <w:sz w:val="16"/>
+                <w:szCs w:val="16"/>
+              </w:rPr>
+              <w:t>}</w:t>
+            </w:r>
+          </w:p>
+        </w:tc>
+        <w:tc>
+          <w:tcPr>
+            <w:tcW w:w="391" w:type="pct"/>
+            <w:tcBorders>
+              <w:top w:val="nil"/>
+              <w:left w:val="nil"/>
+              <w:bottom w:val="single" w:sz="4" w:space="0" w:color="auto"/>
+              <w:right w:val="single" w:sz="4" w:space="0" w:color="auto"/>
+            </w:tcBorders>
+            <w:vAlign w:val="center"/>
+          </w:tcPr>
+          <w:p>
+            <w:pPr>
+              <w:spacing w:after="0" w:line="240" w:lineRule="auto"/>
+              <w:rPr>
+                <w:rFonts w:ascii="Arial" w:eastAsia="Times New Roman" w:hAnsi="Arial" w:cs="Arial"/>
+                <w:color w:val="000000"/>
+                <w:sz w:val="16"/>
+                <w:szCs w:val="16"/>
+              </w:rPr>
+            </w:pPr>
+            <w:r>
+              <w:rPr>
+                <w:rFonts w:ascii="Arial" w:eastAsia="Times New Roman" w:hAnsi="Arial" w:cs="Arial"/>
+                <w:color w:val="000000"/>
+                <w:sz w:val="16"/>
+                <w:szCs w:val="16"/>
+              </w:rPr>
+              <w:t>{</w:t>
+            </w:r>
+            <w:proofErr w:type="spellStart"/>
+            <w:r>
+              <w:rPr>
+                <w:rFonts w:ascii="Arial" w:eastAsia="Times New Roman" w:hAnsi="Arial" w:cs="Arial"/>
+                <w:color w:val="000000"/>
+                <w:sz w:val="16"/>
+                <w:szCs w:val="16"/>
+              </w:rPr>
+              <w:t>email_petugas</w:t>
+            </w:r>
+            <w:proofErr w:type="spellEnd"/>
+            <w:r>
+              <w:rPr>
+                <w:rFonts w:ascii="Arial" w:eastAsia="Times New Roman" w:hAnsi="Arial" w:cs="Arial"/>
+                <w:color w:val="000000"/>
+                <w:sz w:val="16"/>
+                <w:szCs w:val="16"/>
+              </w:rPr>
+              <w:t>}</w:t>
+            </w:r>
+          </w:p>
+        </w:tc>
+        <w:tc>
+          <w:tcPr>
+            <w:tcW w:w="298" w:type="pct"/>
+            <w:tcBorders>
+              <w:top w:val="nil"/>
+              <w:left w:val="nil"/>
+              <w:bottom w:val="single" w:sz="4" w:space="0" w:color="auto"/>
+              <w:right w:val="single" w:sz="4" w:space="0" w:color="auto"/>
+            </w:tcBorders>
+            <w:vAlign w:val="center"/>
+          </w:tcPr>
+          <w:p>
+            <w:pPr>
+              <w:spacing w:after="0" w:line="240" w:lineRule="auto"/>
+              <w:rPr>
+                <w:rFonts w:ascii="Arial" w:eastAsia="Times New Roman" w:hAnsi="Arial" w:cs="Arial"/>
+                <w:color w:val="000000"/>
+                <w:sz w:val="16"/>
+                <w:szCs w:val="16"/>
+              </w:rPr>
+            </w:pPr>
+            <w:r>
+              <w:rPr>
+                <w:rFonts w:ascii="Arial" w:eastAsia="Times New Roman" w:hAnsi="Arial" w:cs="Arial"/>
+                <w:color w:val="000000"/>
+                <w:sz w:val="16"/>
+                <w:szCs w:val="16"/>
+              </w:rPr>
+              <w:t>{</w:t>
+            </w:r>
+            <w:proofErr w:type="spellStart"/>
+            <w:r>
+              <w:rPr>
+                <w:rFonts w:ascii="Arial" w:eastAsia="Times New Roman" w:hAnsi="Arial" w:cs="Arial"/>
+                <w:color w:val="000000"/>
+                <w:sz w:val="16"/>
+                <w:szCs w:val="16"/>
+              </w:rPr>
+              <w:t>nama_ppl</w:t>
+            </w:r>
+            <w:proofErr w:type="spellEnd"/>
+            <w:r>
+              <w:rPr>
+                <w:rFonts w:ascii="Arial" w:eastAsia="Times New Roman" w:hAnsi="Arial" w:cs="Arial"/>
+                <w:color w:val="000000"/>
+                <w:sz w:val="16"/>
+                <w:szCs w:val="16"/>
+              </w:rPr>
+              <w:t>}</w:t>
+            </w:r>
+          </w:p>
+        </w:tc>
+        <w:tc>
+          <w:tcPr>
+            <w:tcW w:w="294" w:type="pct"/>
+            <w:tcBorders>
+              <w:top w:val="nil"/>
+              <w:left w:val="nil"/>
+              <w:bottom w:val="single" w:sz="4" w:space="0" w:color="auto"/>
+              <w:right w:val="single" w:sz="4" w:space="0" w:color="auto"/>
+            </w:tcBorders>
+            <w:vAlign w:val="center"/>
+          </w:tcPr>
+          <w:p>
+            <w:pPr>
+              <w:spacing w:after="0" w:line="240" w:lineRule="auto"/>
+              <w:rPr>
+                <w:rFonts w:ascii="Arial" w:eastAsia="Times New Roman" w:hAnsi="Arial" w:cs="Arial"/>
+                <w:color w:val="000000"/>
+                <w:sz w:val="16"/>
+                <w:szCs w:val="16"/>
+              </w:rPr>
+            </w:pPr>
+            <w:r>
+              <w:rPr>
+                <w:rFonts w:ascii="Arial" w:eastAsia="Times New Roman" w:hAnsi="Arial" w:cs="Arial"/>
+                <w:color w:val="000000"/>
+                <w:sz w:val="16"/>
+                <w:szCs w:val="16"/>
+              </w:rPr>
+              <w:t>{</w:t>
+            </w:r>
+            <w:proofErr w:type="spellStart"/>
+            <w:r>
+              <w:rPr>
+                <w:rFonts w:ascii="Arial" w:eastAsia="Times New Roman" w:hAnsi="Arial" w:cs="Arial"/>
+                <w:color w:val="000000"/>
+                <w:sz w:val="16"/>
+                <w:szCs w:val="16"/>
+              </w:rPr>
+              <w:t>email_ppl</w:t>
+            </w:r>
+            <w:proofErr w:type="spellEnd"/>
+            <w:r>
+              <w:rPr>
+                <w:rFonts w:ascii="Arial" w:eastAsia="Times New Roman" w:hAnsi="Arial" w:cs="Arial"/>
+                <w:color w:val="000000"/>
+                <w:sz w:val="16"/>
+                <w:szCs w:val="16"/>
+              </w:rPr>
+              <w:t>}</w:t>
+            </w:r>
+          </w:p>
+        </w:tc>
+        <w:tc>
+          <w:tcPr>
+            <w:tcW w:w="439" w:type="pct"/>
+            <w:tcBorders>
+              <w:top w:val="nil"/>
+              <w:left w:val="nil"/>
+              <w:bottom w:val="single" w:sz="4" w:space="0" w:color="auto"/>
+              <w:right w:val="single" w:sz="4" w:space="0" w:color="auto"/>
+            </w:tcBorders>
+            <w:vAlign w:val="center"/>
+          </w:tcPr>
+          <w:p>
+            <w:pPr>
+              <w:spacing w:after="0" w:line="240" w:lineRule="auto"/>
+              <w:jc w:val="center"/>
+              <w:rPr>
+                <w:rFonts w:ascii="Arial" w:eastAsia="Times New Roman" w:hAnsi="Arial" w:cs="Arial"/>
+                <w:color w:val="000000"/>
+                <w:sz w:val="16"/>
+                <w:szCs w:val="16"/>
+              </w:rPr>
+            </w:pPr>
+            <w:r>
+              <w:rPr>
+                <w:rFonts w:ascii="Arial" w:eastAsia="Times New Roman" w:hAnsi="Arial" w:cs="Arial"/>
+                <w:color w:val="000000"/>
+                <w:sz w:val="16"/>
+                <w:szCs w:val="16"/>
+              </w:rPr>
+              <w:t>{</w:t>
+            </w:r>
+            <w:proofErr w:type="spellStart"/>
+            <w:r>
+              <w:rPr>
+                <w:rFonts w:ascii="Arial" w:eastAsia="Times New Roman" w:hAnsi="Arial" w:cs="Arial"/>
+                <w:color w:val="000000"/>
+                <w:sz w:val="16"/>
+                <w:szCs w:val="16"/>
+              </w:rPr>
+              <w:t>kode_kecamatan</w:t>
+            </w:r>
+            <w:proofErr w:type="spellEnd"/>
+            <w:r>
+              <w:rPr>
+                <w:rFonts w:ascii="Arial" w:eastAsia="Times New Roman" w:hAnsi="Arial" w:cs="Arial"/>
+                <w:color w:val="000000"/>
+                <w:sz w:val="16"/>
+                <w:szCs w:val="16"/>
+              </w:rPr>
+              <w:t>}</w:t>
+            </w:r>
+          </w:p>
+        </w:tc>
+        <w:tc>
+          <w:tcPr>
+            <w:tcW w:w="417" w:type="pct"/>
+            <w:tcBorders>
+              <w:top w:val="nil"/>
+              <w:left w:val="nil"/>
+              <w:bottom w:val="single" w:sz="4" w:space="0" w:color="auto"/>
+              <w:right w:val="single" w:sz="4" w:space="0" w:color="auto"/>
+            </w:tcBorders>
+            <w:vAlign w:val="center"/>
+          </w:tcPr>
+          <w:p>
+            <w:pPr>
+              <w:spacing w:after="0" w:line="240" w:lineRule="auto"/>
+              <w:jc w:val="center"/>
+              <w:rPr>
+                <w:rFonts w:ascii="Arial" w:eastAsia="Times New Roman" w:hAnsi="Arial" w:cs="Arial"/>
+                <w:color w:val="000000"/>
+                <w:sz w:val="16"/>
+                <w:szCs w:val="16"/>
+              </w:rPr>
+            </w:pPr>
+            <w:r>
+              <w:rPr>
+                <w:rFonts w:ascii="Arial" w:eastAsia="Times New Roman" w:hAnsi="Arial" w:cs="Arial"/>
+                <w:color w:val="000000"/>
+                <w:sz w:val="16"/>
+                <w:szCs w:val="16"/>
+              </w:rPr>
+              <w:t>{</w:t>
+            </w:r>
+            <w:proofErr w:type="spellStart"/>
+            <w:r>
+              <w:rPr>
+                <w:rFonts w:ascii="Arial" w:eastAsia="Times New Roman" w:hAnsi="Arial" w:cs="Arial"/>
+                <w:color w:val="000000"/>
+                <w:sz w:val="16"/>
+                <w:szCs w:val="16"/>
+              </w:rPr>
+              <w:t>kode_kelurahan</w:t>
+            </w:r>
+            <w:proofErr w:type="spellEnd"/>
+            <w:r>
+              <w:rPr>
+                <w:rFonts w:ascii="Arial" w:eastAsia="Times New Roman" w:hAnsi="Arial" w:cs="Arial"/>
+                <w:color w:val="000000"/>
+                <w:sz w:val="16"/>
+                <w:szCs w:val="16"/>
+              </w:rPr>
+              <w:t>}</w:t>
+            </w:r>
+          </w:p>
+        </w:tc>
+        <w:tc>
+          <w:tcPr>
+            <w:tcW w:w="279" w:type="pct"/>
+            <w:tcBorders>
+              <w:top w:val="nil"/>
+              <w:left w:val="nil"/>
+              <w:bottom w:val="single" w:sz="4" w:space="0" w:color="auto"/>
+              <w:right w:val="single" w:sz="4" w:space="0" w:color="auto"/>
+            </w:tcBorders>
+            <w:vAlign w:val="center"/>
+          </w:tcPr>
+          <w:p>
+            <w:pPr>
+              <w:spacing w:after="0" w:line="240" w:lineRule="auto"/>
+              <w:jc w:val="center"/>
+              <w:rPr>
+                <w:rFonts w:ascii="Arial" w:eastAsia="Times New Roman" w:hAnsi="Arial" w:cs="Arial"/>
+                <w:color w:val="000000"/>
+                <w:sz w:val="16"/>
+                <w:szCs w:val="16"/>
+              </w:rPr>
+            </w:pPr>
+            <w:r>
+              <w:rPr>
+                <w:rFonts w:ascii="Arial" w:eastAsia="Times New Roman" w:hAnsi="Arial" w:cs="Arial"/>
+                <w:color w:val="000000"/>
+                <w:sz w:val="16"/>
+                <w:szCs w:val="16"/>
+              </w:rPr>
+              <w:t>{</w:t>
+            </w:r>
+            <w:proofErr w:type="spellStart"/>
+            <w:r>
+              <w:rPr>
+                <w:rFonts w:ascii="Arial" w:eastAsia="Times New Roman" w:hAnsi="Arial" w:cs="Arial"/>
+                <w:color w:val="000000"/>
+                <w:sz w:val="16"/>
+                <w:szCs w:val="16"/>
+              </w:rPr>
+              <w:t>kode_sls</w:t>
+            </w:r>
+            <w:proofErr w:type="spellEnd"/>
+            <w:r>
+              <w:rPr>
+                <w:rFonts w:ascii="Arial" w:eastAsia="Times New Roman" w:hAnsi="Arial" w:cs="Arial"/>
+                <w:color w:val="000000"/>
+                <w:sz w:val="16"/>
+                <w:szCs w:val="16"/>
+              </w:rPr>
+              <w:t>}</w:t>
+            </w:r>
+          </w:p>
+        </w:tc>
+        <w:tc>
+          <w:tcPr>
+            <w:tcW w:w="361" w:type="pct"/>
+            <w:tcBorders>
+              <w:top w:val="nil"/>
+              <w:left w:val="nil"/>
+              <w:bottom w:val="single" w:sz="4" w:space="0" w:color="auto"/>
+              <w:right w:val="single" w:sz="4" w:space="0" w:color="auto"/>
+            </w:tcBorders>
+            <w:noWrap/>
+            <w:vAlign w:val="center"/>
+          </w:tcPr>
+          <w:p>
+            <w:pPr>
+              <w:spacing w:after="0" w:line="240" w:lineRule="auto"/>
+              <w:rPr>
+                <w:rFonts w:ascii="Arial" w:eastAsia="Times New Roman" w:hAnsi="Arial" w:cs="Arial"/>
+                <w:color w:val="000000"/>
+                <w:sz w:val="16"/>
+                <w:szCs w:val="16"/>
+              </w:rPr>
+            </w:pPr>
+            <w:r>
+              <w:rPr>
+                <w:rFonts w:ascii="Arial" w:eastAsia="Times New Roman" w:hAnsi="Arial" w:cs="Arial"/>
+                <w:color w:val="000000"/>
+                <w:sz w:val="16"/>
+                <w:szCs w:val="16"/>
+              </w:rPr>
+              <w:t>{</w:t>
+            </w:r>
+            <w:proofErr w:type="spellStart"/>
+            <w:r>
+              <w:rPr>
+                <w:rFonts w:ascii="Arial" w:eastAsia="Times New Roman" w:hAnsi="Arial" w:cs="Arial"/>
+                <w:color w:val="000000"/>
+                <w:sz w:val="16"/>
+                <w:szCs w:val="16"/>
+              </w:rPr>
+              <w:t>pre_keluarga</w:t>
+            </w:r>
+            <w:proofErr w:type="spellEnd"/>
+            <w:r>
+              <w:rPr>
+                <w:rFonts w:ascii="Arial" w:eastAsia="Times New Roman" w:hAnsi="Arial" w:cs="Arial"/>
+                <w:color w:val="000000"/>
+                <w:sz w:val="16"/>
+                <w:szCs w:val="16"/>
+              </w:rPr>
+              <w:t>}</w:t>
+            </w:r>
+          </w:p>
+        </w:tc>
+        <w:tc>
+          <w:tcPr>
+            <w:tcW w:w="313" w:type="pct"/>
+            <w:tcBorders>
+              <w:top w:val="nil"/>
+              <w:left w:val="nil"/>
+              <w:bottom w:val="single" w:sz="4" w:space="0" w:color="auto"/>
+              <w:right w:val="single" w:sz="4" w:space="0" w:color="auto"/>
+            </w:tcBorders>
+            <w:noWrap/>
+            <w:vAlign w:val="center"/>
+          </w:tcPr>
+          <w:p>
+            <w:pPr>
+              <w:spacing w:after="0" w:line="240" w:lineRule="auto"/>
+              <w:rPr>
+                <w:rFonts w:ascii="Arial" w:eastAsia="Times New Roman" w:hAnsi="Arial" w:cs="Arial"/>
+                <w:color w:val="000000"/>
+                <w:sz w:val="16"/>
+                <w:szCs w:val="16"/>
+              </w:rPr>
+            </w:pPr>
+            <w:r>
+              <w:rPr>
+                <w:rFonts w:ascii="Arial" w:eastAsia="Times New Roman" w:hAnsi="Arial" w:cs="Arial"/>
+                <w:color w:val="000000"/>
+                <w:sz w:val="16"/>
+                <w:szCs w:val="16"/>
+              </w:rPr>
+              <w:t>{</w:t>
+            </w:r>
+            <w:proofErr w:type="spellStart"/>
+            <w:r>
+              <w:rPr>
+                <w:rFonts w:ascii="Arial" w:eastAsia="Times New Roman" w:hAnsi="Arial" w:cs="Arial"/>
+                <w:color w:val="000000"/>
+                <w:sz w:val="16"/>
+                <w:szCs w:val="16"/>
+              </w:rPr>
+              <w:t>pre_usaha</w:t>
+            </w:r>
+            <w:proofErr w:type="spellEnd"/>
+            <w:r>
+              <w:rPr>
+                <w:rFonts w:ascii="Arial" w:eastAsia="Times New Roman" w:hAnsi="Arial" w:cs="Arial"/>
+                <w:color w:val="000000"/>
+                <w:sz w:val="16"/>
+                <w:szCs w:val="16"/>
+              </w:rPr>
+              <w:t>}</w:t>
+            </w:r>
+          </w:p>
+        </w:tc>
+        <w:tc>
+          <w:tcPr>
+            <w:tcW w:w="323" w:type="pct"/>
+            <w:tcBorders>
+              <w:top w:val="nil"/>
+              <w:left w:val="nil"/>
+              <w:bottom w:val="single" w:sz="4" w:space="0" w:color="auto"/>
+              <w:right w:val="single" w:sz="4" w:space="0" w:color="auto"/>
+            </w:tcBorders>
+            <w:noWrap/>
+            <w:vAlign w:val="center"/>
+          </w:tcPr>
+          <w:p>
+            <w:pPr>
+              <w:spacing w:after="0" w:line="240" w:lineRule="auto"/>
+              <w:jc w:val="right"/>
+              <w:rPr>
+                <w:rFonts w:ascii="Arial" w:eastAsia="Times New Roman" w:hAnsi="Arial" w:cs="Arial"/>
+                <w:color w:val="000000"/>
+                <w:sz w:val="16"/>
+                <w:szCs w:val="16"/>
+              </w:rPr>
+            </w:pPr>
+            <w:r>
+              <w:rPr>
+                <w:rFonts w:ascii="Arial" w:eastAsia="Times New Roman" w:hAnsi="Arial" w:cs="Arial"/>
+                <w:color w:val="000000"/>
+                <w:sz w:val="16"/>
+                <w:szCs w:val="16"/>
+              </w:rPr>
+              <w:t>{</w:t>
+            </w:r>
+            <w:proofErr w:type="spellStart"/>
+            <w:r>
+              <w:rPr>
+                <w:rFonts w:ascii="Arial" w:eastAsia="Times New Roman" w:hAnsi="Arial" w:cs="Arial"/>
+                <w:color w:val="000000"/>
+                <w:sz w:val="16"/>
+                <w:szCs w:val="16"/>
+              </w:rPr>
+              <w:t>jumlah_pre</w:t>
+            </w:r>
+            <w:proofErr w:type="spellEnd"/>
+            <w:r>
+              <w:rPr>
+                <w:rFonts w:ascii="Arial" w:eastAsia="Times New Roman" w:hAnsi="Arial" w:cs="Arial"/>
+                <w:color w:val="000000"/>
+                <w:sz w:val="16"/>
+                <w:szCs w:val="16"/>
+              </w:rPr>
+              <w:t>}</w:t>
+            </w:r>
+          </w:p>
+        </w:tc>
+        <w:tc>
+          <w:tcPr>
+            <w:tcW w:w="284" w:type="pct"/>
+            <w:tcBorders>
+              <w:top w:val="nil"/>
+              <w:left w:val="nil"/>
+              <w:bottom w:val="single" w:sz="4" w:space="0" w:color="auto"/>
+              <w:right w:val="single" w:sz="4" w:space="0" w:color="auto"/>
+            </w:tcBorders>
+            <w:noWrap/>
+            <w:vAlign w:val="center"/>
+          </w:tcPr>
+          <w:p>
+            <w:pPr>
+              <w:spacing w:after="0" w:line="240" w:lineRule="auto"/>
+              <w:jc w:val="right"/>
+              <w:rPr>
+                <w:rFonts w:ascii="Arial" w:eastAsia="Times New Roman" w:hAnsi="Arial" w:cs="Arial"/>
+                <w:color w:val="000000"/>
+                <w:sz w:val="16"/>
+                <w:szCs w:val="16"/>
+              </w:rPr>
+            </w:pPr>
+            <w:r>
+              <w:rPr>
+                <w:rFonts w:ascii="Arial" w:eastAsia="Times New Roman" w:hAnsi="Arial" w:cs="Arial"/>
+                <w:color w:val="000000"/>
+                <w:sz w:val="16"/>
+                <w:szCs w:val="16"/>
+              </w:rPr>
+              <w:t>{</w:t>
+            </w:r>
+            <w:proofErr w:type="spellStart"/>
+            <w:r>
+              <w:rPr>
+                <w:rFonts w:ascii="Arial" w:eastAsia="Times New Roman" w:hAnsi="Arial" w:cs="Arial"/>
+                <w:color w:val="000000"/>
+                <w:sz w:val="16"/>
+                <w:szCs w:val="16"/>
+              </w:rPr>
+              <w:t>realisasi</w:t>
+            </w:r>
+            <w:proofErr w:type="spellEnd"/>
+            <w:r>
+              <w:rPr>
+                <w:rFonts w:ascii="Arial" w:eastAsia="Times New Roman" w:hAnsi="Arial" w:cs="Arial"/>
+                <w:color w:val="000000"/>
+                <w:sz w:val="16"/>
+                <w:szCs w:val="16"/>
+              </w:rPr>
+              <w:t>}</w:t>
+            </w:r>
+          </w:p>
+        </w:tc>
+        <w:tc>
+          <w:tcPr>
+            <w:tcW w:w="531" w:type="pct"/>
+            <w:tcBorders>
+              <w:top w:val="nil"/>
+              <w:left w:val="nil"/>
+              <w:bottom w:val="single" w:sz="4" w:space="0" w:color="auto"/>
+              <w:right w:val="single" w:sz="4" w:space="0" w:color="auto"/>
+            </w:tcBorders>
+            <w:noWrap/>
+            <w:vAlign w:val="center"/>
+          </w:tcPr>
+          <w:p>
+            <w:pPr>
+              <w:spacing w:after="0" w:line="240" w:lineRule="auto"/>
+              <w:jc w:val="right"/>
+              <w:rPr>
+                <w:rFonts w:ascii="Arial" w:eastAsia="Times New Roman" w:hAnsi="Arial" w:cs="Arial"/>
+                <w:color w:val="000000"/>
+                <w:sz w:val="16"/>
+                <w:szCs w:val="16"/>
+              </w:rPr>
+            </w:pPr>
+            <w:r>
+              <w:rPr>
+                <w:rFonts w:ascii="Arial" w:eastAsia="Times New Roman" w:hAnsi="Arial" w:cs="Arial"/>
+                <w:color w:val="000000"/>
+                <w:sz w:val="16"/>
+                <w:szCs w:val="16"/>
+              </w:rPr>
+              <w:t>{</w:t>
+            </w:r>
+            <w:proofErr w:type="spellStart"/>
+            <w:r>
+              <w:rPr>
+                <w:rFonts w:ascii="Arial" w:eastAsia="Times New Roman" w:hAnsi="Arial" w:cs="Arial"/>
+                <w:color w:val="000000"/>
+                <w:sz w:val="16"/>
+                <w:szCs w:val="16"/>
+              </w:rPr>
+              <w:t>pesentase</w:t>
+            </w:r>
+            <w:proofErr w:type="spellEnd"/>
+            <w:r>
+              <w:rPr>
+                <w:rFonts w:ascii="Arial" w:eastAsia="Times New Roman" w:hAnsi="Arial" w:cs="Arial"/>
+                <w:color w:val="000000"/>
+                <w:sz w:val="16"/>
+                <w:szCs w:val="16"/>
+              </w:rPr>
+              <w:t>}</w:t>
+            </w:r>
+            <w:r>
+              <w:rPr>
+                <w:rFonts w:ascii="Arial" w:eastAsia="Times New Roman" w:hAnsi="Arial" w:cs="Arial"/>
+                <w:color w:val="000000"/>
+                <w:sz w:val="16"/>
+                <w:szCs w:val="16"/>
+              </w:rPr>
+              <w:t>{/</w:t>
+            </w:r>
+            <w:proofErr w:type="spellStart"/>
+            <w:r>
+              <w:rPr>
+                <w:rFonts w:ascii="Arial" w:eastAsia="Times New Roman" w:hAnsi="Arial" w:cs="Arial"/>
+                <w:color w:val="000000"/>
+                <w:sz w:val="16"/>
+                <w:szCs w:val="16"/>
+              </w:rPr>
+              <w:t>peserta</w:t>
+            </w:r>
+            <w:proofErr w:type="spellEnd"/>
+            <w:r>
+              <w:rPr>
+                <w:rFonts w:ascii="Arial" w:eastAsia="Times New Roman" w:hAnsi="Arial" w:cs="Arial"/>
+                <w:color w:val="000000"/>
+                <w:sz w:val="16"/>
+                <w:szCs w:val="16"/>
+              </w:rPr>
+              <w:t>}</w:t>
+            </w:r>
+          </w:p>
+        </w:tc>
+        <w:tc>
+          <w:tcPr>
+            <w:tcW w:w="318" w:type="pct"/>
+            <w:tcBorders>
+              <w:top w:val="nil"/>
+              <w:left w:val="single" w:sz="4" w:space="0" w:color="auto"/>
+              <w:bottom w:val="single" w:sz="4" w:space="0" w:color="000000"/>
+              <w:right w:val="single" w:sz="4" w:space="0" w:color="auto"/>
+            </w:tcBorders>
+          </w:tcPr>
+          <w:p>
+            <w:pPr>
+              <w:spacing w:after="0" w:line="240" w:lineRule="auto"/>
+              <w:rPr>
+                <w:rFonts w:ascii="Arial" w:eastAsia="Times New Roman" w:hAnsi="Arial" w:cs="Arial"/>
+                <w:color w:val="000000"/>
+                <w:sz w:val="16"/>
+                <w:szCs w:val="16"/>
+              </w:rPr>
+            </w:pPr>
+          </w:p>
+        </w:tc>
+      </w:tr>
+      <w:tr>
+        <w:trPr>
+          <w:trHeight w:val="450"/>
+        </w:trPr>
+        <w:tc>
+          <w:tcPr>
+            <w:tcW w:w="2869" w:type="pct"/>
+            <w:gridSpan w:val="8"/>
+            <w:tcBorders>
+              <w:top w:val="single" w:sz="4" w:space="0" w:color="auto"/>
+              <w:left w:val="single" w:sz="4" w:space="0" w:color="auto"/>
+              <w:bottom w:val="single" w:sz="4" w:space="0" w:color="auto"/>
+              <w:right w:val="single" w:sz="4" w:space="0" w:color="000000"/>
+            </w:tcBorders>
+            <w:noWrap/>
+            <w:vAlign w:val="center"/>
+            <w:hideMark/>
+          </w:tcPr>
+          <w:p>
+            <w:pPr>
+              <w:spacing w:after="0" w:line="240" w:lineRule="auto"/>
+              <w:jc w:val="center"/>
+              <w:rPr>
+                <w:rFonts w:ascii="Arial" w:eastAsia="Times New Roman" w:hAnsi="Arial" w:cs="Arial"/>
+                <w:b/>
+                <w:bCs/>
+                <w:color w:val="000000"/>
+                <w:sz w:val="16"/>
+                <w:szCs w:val="16"/>
+              </w:rPr>
+            </w:pPr>
+            <w:proofErr w:type="spellStart"/>
+            <w:r>
+              <w:rPr>
+                <w:rFonts w:ascii="Arial" w:eastAsia="Times New Roman" w:hAnsi="Arial" w:cs="Arial"/>
+                <w:b/>
+                <w:bCs/>
+                <w:color w:val="000000"/>
+                <w:sz w:val="16"/>
+                <w:szCs w:val="16"/>
+              </w:rPr>
+              <w:t>Jumlah</w:t>
+            </w:r>
+            <w:proofErr w:type="spellEnd"/>
+          </w:p>
+        </w:tc>
+        <w:tc>
+          <w:tcPr>
+            <w:tcW w:w="361" w:type="pct"/>
+            <w:tcBorders>
+              <w:top w:val="nil"/>
+              <w:left w:val="nil"/>
+              <w:bottom w:val="single" w:sz="4" w:space="0" w:color="auto"/>
+              <w:right w:val="single" w:sz="4" w:space="0" w:color="auto"/>
+            </w:tcBorders>
+            <w:noWrap/>
+            <w:vAlign w:val="center"/>
+            <w:hideMark/>
+          </w:tcPr>
+          <w:p>
+            <w:pPr>
+              <w:spacing w:after="0" w:line="240" w:lineRule="auto"/>
+              <w:rPr>
+                <w:rFonts w:ascii="Arial" w:eastAsia="Times New Roman" w:hAnsi="Arial" w:cs="Arial"/>
+                <w:b/>
+                <w:bCs/>
+                <w:color w:val="000000"/>
+                <w:sz w:val="16"/>
+                <w:szCs w:val="16"/>
+              </w:rPr>
+            </w:pPr>
+            <w:r>
+              <w:rPr>
+                <w:rFonts w:ascii="Arial" w:eastAsia="Times New Roman" w:hAnsi="Arial" w:cs="Arial"/>
+                <w:b/>
+                <w:bCs/>
+                <w:color w:val="000000"/>
+                <w:sz w:val="16"/>
+                <w:szCs w:val="16"/>
+              </w:rPr>
+              <w:t> </w:t>
+            </w:r>
+          </w:p>
+        </w:tc>
+        <w:tc>
+          <w:tcPr>
+            <w:tcW w:w="313" w:type="pct"/>
+            <w:tcBorders>
+              <w:top w:val="nil"/>
+              <w:left w:val="nil"/>
+              <w:bottom w:val="single" w:sz="4" w:space="0" w:color="auto"/>
+              <w:right w:val="single" w:sz="4" w:space="0" w:color="auto"/>
+            </w:tcBorders>
+            <w:noWrap/>
+            <w:vAlign w:val="center"/>
+            <w:hideMark/>
+          </w:tcPr>
+          <w:p>
+            <w:pPr>
+              <w:spacing w:after="0" w:line="240" w:lineRule="auto"/>
+              <w:rPr>
+                <w:rFonts w:ascii="Arial" w:eastAsia="Times New Roman" w:hAnsi="Arial" w:cs="Arial"/>
+                <w:b/>
+                <w:bCs/>
+                <w:color w:val="000000"/>
+                <w:sz w:val="16"/>
+                <w:szCs w:val="16"/>
+              </w:rPr>
+            </w:pPr>
+            <w:r>
+              <w:rPr>
+                <w:rFonts w:ascii="Arial" w:eastAsia="Times New Roman" w:hAnsi="Arial" w:cs="Arial"/>
+                <w:b/>
+                <w:bCs/>
+                <w:color w:val="000000"/>
+                <w:sz w:val="16"/>
+                <w:szCs w:val="16"/>
+              </w:rPr>
+              <w:t> </w:t>
+            </w:r>
+          </w:p>
+        </w:tc>
+        <w:tc>
+          <w:tcPr>
+            <w:tcW w:w="323" w:type="pct"/>
+            <w:tcBorders>
+              <w:top w:val="nil"/>
+              <w:left w:val="nil"/>
+              <w:bottom w:val="single" w:sz="4" w:space="0" w:color="auto"/>
+              <w:right w:val="single" w:sz="4" w:space="0" w:color="auto"/>
+            </w:tcBorders>
+            <w:noWrap/>
+            <w:vAlign w:val="center"/>
+          </w:tcPr>
+          <w:p>
+            <w:pPr>
+              <w:spacing w:after="0" w:line="240" w:lineRule="auto"/>
+              <w:jc w:val="right"/>
+              <w:rPr>
+                <w:rFonts w:ascii="Arial" w:eastAsia="Times New Roman" w:hAnsi="Arial" w:cs="Arial"/>
+                <w:b/>
+                <w:bCs/>
+                <w:color w:val="000000"/>
+                <w:sz w:val="16"/>
+                <w:szCs w:val="16"/>
+              </w:rPr>
+            </w:pPr>
+          </w:p>
+        </w:tc>
+        <w:tc>
+          <w:tcPr>
+            <w:tcW w:w="284" w:type="pct"/>
+            <w:tcBorders>
+              <w:top w:val="nil"/>
+              <w:left w:val="nil"/>
+              <w:bottom w:val="single" w:sz="4" w:space="0" w:color="auto"/>
+              <w:right w:val="single" w:sz="4" w:space="0" w:color="auto"/>
+            </w:tcBorders>
+            <w:noWrap/>
+            <w:vAlign w:val="center"/>
+          </w:tcPr>
+          <w:p>
+            <w:pPr>
+              <w:spacing w:after="0" w:line="240" w:lineRule="auto"/>
+              <w:rPr>
+                <w:rFonts w:ascii="Arial" w:eastAsia="Times New Roman" w:hAnsi="Arial" w:cs="Arial"/>
+                <w:b/>
+                <w:bCs/>
+                <w:color w:val="000000"/>
+                <w:sz w:val="16"/>
+                <w:szCs w:val="16"/>
+              </w:rPr>
+            </w:pPr>
+          </w:p>
+        </w:tc>
+        <w:tc>
+          <w:tcPr>
+            <w:tcW w:w="531" w:type="pct"/>
+            <w:tcBorders>
+              <w:top w:val="nil"/>
+              <w:left w:val="nil"/>
+              <w:bottom w:val="single" w:sz="4" w:space="0" w:color="auto"/>
+              <w:right w:val="single" w:sz="4" w:space="0" w:color="auto"/>
+            </w:tcBorders>
+            <w:noWrap/>
+            <w:vAlign w:val="center"/>
+          </w:tcPr>
+          <w:p>
+            <w:pPr>
+              <w:spacing w:after="0" w:line="240" w:lineRule="auto"/>
+              <w:jc w:val="right"/>
+              <w:rPr>
+                <w:rFonts w:ascii="Arial" w:eastAsia="Times New Roman" w:hAnsi="Arial" w:cs="Arial"/>
+                <w:b/>
+                <w:bCs/>
+                <w:color w:val="000000"/>
+                <w:sz w:val="16"/>
+                <w:szCs w:val="16"/>
+              </w:rPr>
+            </w:pPr>
+            <w:r>
+              <w:rPr>
+                <w:rFonts w:ascii="Arial" w:eastAsia="Times New Roman" w:hAnsi="Arial" w:cs="Arial"/>
+                <w:b/>
+                <w:bCs/>
+                <w:color w:val="000000"/>
+                <w:sz w:val="16"/>
+                <w:szCs w:val="16"/>
+              </w:rPr>
+              <w:t>{</w:t>
+            </w:r>
+            <w:proofErr w:type="spellStart"/>
+            <w:r>
+              <w:rPr>
+                <w:rFonts w:ascii="Arial" w:eastAsia="Times New Roman" w:hAnsi="Arial" w:cs="Arial"/>
+                <w:b/>
+                <w:bCs/>
+                <w:color w:val="000000"/>
+                <w:sz w:val="16"/>
+                <w:szCs w:val="16"/>
+              </w:rPr>
+              <w:t>average_persentase</w:t>
+            </w:r>
+            <w:proofErr w:type="spellEnd"/>
+            <w:r>
+              <w:rPr>
+                <w:rFonts w:ascii="Arial" w:eastAsia="Times New Roman" w:hAnsi="Arial" w:cs="Arial"/>
+                <w:b/>
+                <w:bCs/>
+                <w:color w:val="000000"/>
+                <w:sz w:val="16"/>
+                <w:szCs w:val="16"/>
+              </w:rPr>
+              <w:t>}</w:t>
+            </w:r>
+          </w:p>
+        </w:tc>
+        <w:tc>
+          <w:tcPr>
+            <w:tcW w:w="318" w:type="pct"/>
+            <w:tcBorders>
+              <w:top w:val="nil"/>
+              <w:left w:val="nil"/>
+              <w:bottom w:val="single" w:sz="4" w:space="0" w:color="auto"/>
+              <w:right w:val="single" w:sz="4" w:space="0" w:color="auto"/>
+            </w:tcBorders>
+            <w:vAlign w:val="center"/>
+            <w:hideMark/>
+          </w:tcPr>
+          <w:p>
+            <w:pPr>
+              <w:spacing w:after="0" w:line="240" w:lineRule="auto"/>
+              <w:jc w:val="center"/>
+              <w:rPr>
+                <w:rFonts w:ascii="Arial" w:eastAsia="Times New Roman" w:hAnsi="Arial" w:cs="Arial"/>
+                <w:b/>
+                <w:bCs/>
+                <w:color w:val="000000"/>
+                <w:sz w:val="16"/>
+                <w:szCs w:val="16"/>
+              </w:rPr>
+            </w:pPr>
+            <w:r>
+              <w:rPr>
+                <w:rFonts w:ascii="Arial" w:eastAsia="Times New Roman" w:hAnsi="Arial" w:cs="Arial"/>
+                <w:b/>
+                <w:bCs/>
+                <w:color w:val="000000"/>
+                <w:sz w:val="16"/>
+                <w:szCs w:val="16"/>
+              </w:rPr>
+              <w:t>{status}</w:t>
+            </w:r>
+          </w:p>
+        </w:tc>
+      </w:tr>
+    </w:tbl>
+    <w:p>
+      <w:pPr>
+        <w:rPr>
+          <w:i/>
+          <w:iCs/>
+          <w:sz w:val="20"/>
+          <w:szCs w:val="20"/>
+        </w:rPr>
+      </w:pPr>
+      <w:r>
+        <w:rPr>
+          <w:i/>
+          <w:iCs/>
+          <w:sz w:val="20"/>
+          <w:szCs w:val="20"/>
+        </w:rPr>
+        <w:t>*</w:t>
+      </w:r>
+      <w:proofErr w:type="spellStart"/>
+      <w:r>
+        <w:rPr>
+          <w:i/>
+          <w:iCs/>
+          <w:sz w:val="20"/>
+          <w:szCs w:val="20"/>
+        </w:rPr>
+        <w:t>Realisasi</w:t>
+      </w:r>
+      <w:proofErr w:type="spellEnd"/>
+      <w:r>
+        <w:rPr>
+          <w:i/>
+          <w:iCs/>
+          <w:sz w:val="20"/>
+          <w:szCs w:val="20"/>
+        </w:rPr>
+        <w:t xml:space="preserve"> </w:t>
+      </w:r>
+      <w:proofErr w:type="spellStart"/>
+      <w:r>
+        <w:rPr>
+          <w:i/>
+          <w:iCs/>
+          <w:sz w:val="20"/>
+          <w:szCs w:val="20"/>
+        </w:rPr>
+        <w:t>berdasarkan</w:t>
+      </w:r>
+      <w:proofErr w:type="spellEnd"/>
+      <w:r>
+        <w:rPr>
+          <w:i/>
+          <w:iCs/>
+          <w:sz w:val="20"/>
+          <w:szCs w:val="20"/>
+        </w:rPr>
+        <w:t xml:space="preserve"> </w:t>
+      </w:r>
+      <w:proofErr w:type="spellStart"/>
+      <w:r>
+        <w:rPr>
+          <w:i/>
+          <w:iCs/>
+          <w:sz w:val="20"/>
+          <w:szCs w:val="20"/>
+        </w:rPr>
+        <w:t>jumlah</w:t>
+      </w:r>
+      <w:proofErr w:type="spellEnd"/>
+      <w:r>
+        <w:rPr>
+          <w:i/>
+          <w:iCs/>
+          <w:sz w:val="20"/>
+          <w:szCs w:val="20"/>
+        </w:rPr>
+        <w:t xml:space="preserve"> </w:t>
+      </w:r>
+      <w:proofErr w:type="spellStart"/>
+      <w:r>
+        <w:rPr>
+          <w:i/>
+          <w:iCs/>
+          <w:sz w:val="20"/>
+          <w:szCs w:val="20"/>
+        </w:rPr>
+        <w:t>hasil</w:t>
+      </w:r>
+      <w:proofErr w:type="spellEnd"/>
+      <w:r>
+        <w:rPr>
+          <w:i/>
+          <w:iCs/>
+          <w:sz w:val="20"/>
+          <w:szCs w:val="20"/>
+        </w:rPr>
+        <w:t xml:space="preserve"> </w:t>
+      </w:r>
+      <w:proofErr w:type="spellStart"/>
+      <w:r>
+        <w:rPr>
+          <w:i/>
+          <w:iCs/>
+          <w:sz w:val="20"/>
+          <w:szCs w:val="20"/>
+        </w:rPr>
+        <w:t>pemeriksaan</w:t>
+      </w:r>
+      <w:proofErr w:type="spellEnd"/>
+      <w:r>
+        <w:rPr>
+          <w:i/>
+          <w:iCs/>
+          <w:sz w:val="20"/>
+          <w:szCs w:val="20"/>
+        </w:rPr>
+        <w:t xml:space="preserve"> yang </w:t>
+      </w:r>
+      <w:proofErr w:type="spellStart"/>
+      <w:r>
+        <w:rPr>
+          <w:i/>
+          <w:iCs/>
+          <w:sz w:val="20"/>
+          <w:szCs w:val="20"/>
+        </w:rPr>
+        <w:t>telah</w:t>
+      </w:r>
+      <w:proofErr w:type="spellEnd"/>
+      <w:r>
+        <w:rPr>
+          <w:i/>
+          <w:iCs/>
+          <w:sz w:val="20"/>
+          <w:szCs w:val="20"/>
+        </w:rPr>
+        <w:t xml:space="preserve"> </w:t>
+      </w:r>
+      <w:proofErr w:type="spellStart"/>
+      <w:r>
+        <w:rPr>
+          <w:i/>
+          <w:iCs/>
+          <w:sz w:val="20"/>
+          <w:szCs w:val="20"/>
+        </w:rPr>
+        <w:t>dilakukan</w:t>
+      </w:r>
+      <w:proofErr w:type="spellEnd"/>
+    </w:p>
+    <w:p/>
+    <w:p>
+      <w:pPr>
+        <w:widowControl w:val="0"/>
+        <w:spacing w:after="0" w:line="240" w:lineRule="auto"/>
+        <w:ind w:left="360"/>
+        <w:rPr>
+          <w:rFonts w:ascii="Bookman Old Style" w:eastAsia="Bookman Old Style" w:hAnsi="Bookman Old Style" w:cs="Bookman Old Style"/>
+          <w:sz w:val="24"/>
+          <w:szCs w:val="24"/>
+        </w:rPr>
+      </w:pPr>
+    </w:p>
+    <w:p>
+      <w:pPr>
+        <w:pBdr>
+          <w:top w:val="nil"/>
+          <w:left w:val="nil"/>
+          <w:bottom w:val="nil"/>
+          <w:right w:val="nil"/>
+          <w:between w:val="nil"/>
+        </w:pBdr>
+        <w:spacing w:after="0" w:line="240" w:lineRule="auto"/>
+        <w:ind w:left="-11"/>
+        <w:jc w:val="both"/>
+        <w:rPr>
+          <w:rFonts w:ascii="Bookman Old Style" w:eastAsia="Bookman Old Style" w:hAnsi="Bookman Old Style" w:cs="Bookman Old Style"/>
+          <w:i/>
+          <w:iCs/>
+          <w:sz w:val="16"/>
+          <w:szCs w:val="16"/>
+        </w:rPr>
+      </w:pPr>
     </w:p>
     <w:p>
       <w:pPr>

</xml_diff>